<commit_message>
docker - compose updated
</commit_message>
<xml_diff>
--- a/Docker/9-compose.docx
+++ b/Docker/9-compose.docx
@@ -1,6 +1,6 @@
 
 <file path=word/document.xml><?xml version="1.0" encoding="utf-8"?>
-<w:document xmlns:wpc="http://schemas.microsoft.com/office/word/2010/wordprocessingCanvas" xmlns:cx="http://schemas.microsoft.com/office/drawing/2014/chartex" xmlns:cx1="http://schemas.microsoft.com/office/drawing/2015/9/8/chartex" xmlns:cx2="http://schemas.microsoft.com/office/drawing/2015/10/21/chartex" xmlns:cx3="http://schemas.microsoft.com/office/drawing/2016/5/9/chartex" xmlns:cx4="http://schemas.microsoft.com/office/drawing/2016/5/10/chartex" xmlns:cx5="http://schemas.microsoft.com/office/drawing/2016/5/11/chartex" xmlns:cx6="http://schemas.microsoft.com/office/drawing/2016/5/12/chartex" xmlns:cx7="http://schemas.microsoft.com/office/drawing/2016/5/13/chartex" xmlns:cx8="http://schemas.microsoft.com/office/drawing/2016/5/14/chartex" xmlns:mc="http://schemas.openxmlformats.org/markup-compatibility/2006" xmlns:aink="http://schemas.microsoft.com/office/drawing/2016/ink" xmlns:am3d="http://schemas.microsoft.com/office/drawing/2017/model3d" xmlns:o="urn:schemas-microsoft-com:office:office" xmlns:oel="http://schemas.microsoft.com/office/2019/extlst" xmlns:r="http://schemas.openxmlformats.org/officeDocument/2006/relationships" xmlns:m="http://schemas.openxmlformats.org/officeDocument/2006/math" xmlns:v="urn:schemas-microsoft-com:vml" xmlns:wp14="http://schemas.microsoft.com/office/word/2010/wordprocessingDrawing" xmlns:wp="http://schemas.openxmlformats.org/drawingml/2006/wordprocessingDrawing" xmlns:w10="urn:schemas-microsoft-com:office:word" xmlns:w="http://schemas.openxmlformats.org/wordprocessingml/2006/main" xmlns:w14="http://schemas.microsoft.com/office/word/2010/wordml" xmlns:w15="http://schemas.microsoft.com/office/word/2012/wordml" xmlns:w16cex="http://schemas.microsoft.com/office/word/2018/wordml/cex" xmlns:w16cid="http://schemas.microsoft.com/office/word/2016/wordml/cid" xmlns:w16="http://schemas.microsoft.com/office/word/2018/wordml" xmlns:w16sdtdh="http://schemas.microsoft.com/office/word/2020/wordml/sdtdatahash" xmlns:w16se="http://schemas.microsoft.com/office/word/2015/wordml/symex" xmlns:wpg="http://schemas.microsoft.com/office/word/2010/wordprocessingGroup" xmlns:wpi="http://schemas.microsoft.com/office/word/2010/wordprocessingInk" xmlns:wne="http://schemas.microsoft.com/office/word/2006/wordml" xmlns:wps="http://schemas.microsoft.com/office/word/2010/wordprocessingShape" mc:Ignorable="w14 w15 w16se w16cid w16 w16cex w16sdtdh wp14">
+<w:document xmlns:wpc="http://schemas.microsoft.com/office/word/2010/wordprocessingCanvas" xmlns:cx="http://schemas.microsoft.com/office/drawing/2014/chartex" xmlns:cx1="http://schemas.microsoft.com/office/drawing/2015/9/8/chartex" xmlns:cx2="http://schemas.microsoft.com/office/drawing/2015/10/21/chartex" xmlns:cx3="http://schemas.microsoft.com/office/drawing/2016/5/9/chartex" xmlns:cx4="http://schemas.microsoft.com/office/drawing/2016/5/10/chartex" xmlns:cx5="http://schemas.microsoft.com/office/drawing/2016/5/11/chartex" xmlns:cx6="http://schemas.microsoft.com/office/drawing/2016/5/12/chartex" xmlns:cx7="http://schemas.microsoft.com/office/drawing/2016/5/13/chartex" xmlns:cx8="http://schemas.microsoft.com/office/drawing/2016/5/14/chartex" xmlns:mc="http://schemas.openxmlformats.org/markup-compatibility/2006" xmlns:aink="http://schemas.microsoft.com/office/drawing/2016/ink" xmlns:am3d="http://schemas.microsoft.com/office/drawing/2017/model3d" xmlns:o="urn:schemas-microsoft-com:office:office" xmlns:oel="http://schemas.microsoft.com/office/2019/extlst" xmlns:r="http://schemas.openxmlformats.org/officeDocument/2006/relationships" xmlns:m="http://schemas.openxmlformats.org/officeDocument/2006/math" xmlns:v="urn:schemas-microsoft-com:vml" xmlns:wp14="http://schemas.microsoft.com/office/word/2010/wordprocessingDrawing" xmlns:wp="http://schemas.openxmlformats.org/drawingml/2006/wordprocessingDrawing" xmlns:w10="urn:schemas-microsoft-com:office:word" xmlns:w="http://schemas.openxmlformats.org/wordprocessingml/2006/main" xmlns:w14="http://schemas.microsoft.com/office/word/2010/wordml" xmlns:w15="http://schemas.microsoft.com/office/word/2012/wordml" xmlns:w16cex="http://schemas.microsoft.com/office/word/2018/wordml/cex" xmlns:w16cid="http://schemas.microsoft.com/office/word/2016/wordml/cid" xmlns:w16="http://schemas.microsoft.com/office/word/2018/wordml" xmlns:w16du="http://schemas.microsoft.com/office/word/2023/wordml/word16du" xmlns:w16sdtdh="http://schemas.microsoft.com/office/word/2020/wordml/sdtdatahash" xmlns:w16sdtfl="http://schemas.microsoft.com/office/word/2024/wordml/sdtformatlock" xmlns:w16se="http://schemas.microsoft.com/office/word/2015/wordml/symex" xmlns:wpg="http://schemas.microsoft.com/office/word/2010/wordprocessingGroup" xmlns:wpi="http://schemas.microsoft.com/office/word/2010/wordprocessingInk" xmlns:wne="http://schemas.microsoft.com/office/word/2006/wordml" xmlns:wps="http://schemas.microsoft.com/office/word/2010/wordprocessingShape" mc:Ignorable="w14 w15 w16se w16cid w16 w16cex w16sdtdh w16sdtfl w16du wp14">
   <w:body>
     <w:p>
       <w:pPr>
@@ -7422,6 +7422,7 @@
                               <w:t>/</w:t>
                             </w:r>
                             <w:proofErr w:type="spellStart"/>
+                            <w:proofErr w:type="gramStart"/>
                             <w:r>
                               <w:rPr>
                                 <w:rFonts w:asciiTheme="majorBidi" w:hAnsiTheme="majorBidi" w:cstheme="majorBidi"/>
@@ -7513,6 +7514,7 @@
                               <w:t>conf.d</w:t>
                             </w:r>
                             <w:proofErr w:type="spellEnd"/>
+                            <w:proofErr w:type="gramEnd"/>
                             <w:r>
                               <w:rPr>
                                 <w:rFonts w:asciiTheme="majorBidi" w:hAnsiTheme="majorBidi" w:cstheme="majorBidi"/>
@@ -9572,6 +9574,7 @@
                         <w:t>/</w:t>
                       </w:r>
                       <w:proofErr w:type="spellStart"/>
+                      <w:proofErr w:type="gramStart"/>
                       <w:r>
                         <w:rPr>
                           <w:rFonts w:asciiTheme="majorBidi" w:hAnsiTheme="majorBidi" w:cstheme="majorBidi"/>
@@ -9663,6 +9666,7 @@
                         <w:t>conf.d</w:t>
                       </w:r>
                       <w:proofErr w:type="spellEnd"/>
+                      <w:proofErr w:type="gramEnd"/>
                       <w:r>
                         <w:rPr>
                           <w:rFonts w:asciiTheme="majorBidi" w:hAnsiTheme="majorBidi" w:cstheme="majorBidi"/>
@@ -16016,8 +16020,22 @@
                                 <w:sz w:val="28"/>
                                 <w:szCs w:val="28"/>
                               </w:rPr>
-                              <w:t>/backend/.env</w:t>
-                            </w:r>
+                              <w:t>/backend</w:t>
+                            </w:r>
+                            <w:proofErr w:type="gramStart"/>
+                            <w:r>
+                              <w:rPr>
+                                <w:rFonts w:asciiTheme="majorBidi" w:hAnsiTheme="majorBidi" w:cstheme="majorBidi"/>
+                                <w:b/>
+                                <w:bCs/>
+                                <w:i/>
+                                <w:iCs/>
+                                <w:sz w:val="28"/>
+                                <w:szCs w:val="28"/>
+                              </w:rPr>
+                              <w:t>/.env</w:t>
+                            </w:r>
+                            <w:proofErr w:type="gramEnd"/>
                           </w:p>
                           <w:p>
                             <w:pPr>
@@ -18396,8 +18414,22 @@
                           <w:sz w:val="28"/>
                           <w:szCs w:val="28"/>
                         </w:rPr>
-                        <w:t>/backend/.env</w:t>
-                      </w:r>
+                        <w:t>/backend</w:t>
+                      </w:r>
+                      <w:proofErr w:type="gramStart"/>
+                      <w:r>
+                        <w:rPr>
+                          <w:rFonts w:asciiTheme="majorBidi" w:hAnsiTheme="majorBidi" w:cstheme="majorBidi"/>
+                          <w:b/>
+                          <w:bCs/>
+                          <w:i/>
+                          <w:iCs/>
+                          <w:sz w:val="28"/>
+                          <w:szCs w:val="28"/>
+                        </w:rPr>
+                        <w:t>/.env</w:t>
+                      </w:r>
+                      <w:proofErr w:type="gramEnd"/>
                     </w:p>
                     <w:p>
                       <w:pPr>
@@ -25912,6 +25944,610 @@
     </w:p>
     <w:p>
       <w:pPr>
+        <w:pStyle w:val="ListParagraph"/>
+        <w:numPr>
+          <w:ilvl w:val="0"/>
+          <w:numId w:val="25"/>
+        </w:numPr>
+        <w:spacing w:after="60"/>
+        <w:ind w:left="360"/>
+        <w:rPr>
+          <w:rFonts w:asciiTheme="majorBidi" w:hAnsiTheme="majorBidi" w:cstheme="majorBidi"/>
+          <w:sz w:val="28"/>
+          <w:szCs w:val="28"/>
+        </w:rPr>
+      </w:pPr>
+      <w:r>
+        <w:rPr>
+          <w:rFonts w:asciiTheme="majorBidi" w:hAnsiTheme="majorBidi" w:cstheme="majorBidi"/>
+          <w:sz w:val="28"/>
+          <w:szCs w:val="28"/>
+        </w:rPr>
+        <w:t xml:space="preserve">When using bind/mount, you may need to </w:t>
+      </w:r>
+      <w:proofErr w:type="gramStart"/>
+      <w:r>
+        <w:rPr>
+          <w:rFonts w:asciiTheme="majorBidi" w:hAnsiTheme="majorBidi" w:cstheme="majorBidi"/>
+          <w:sz w:val="28"/>
+          <w:szCs w:val="28"/>
+        </w:rPr>
+        <w:t xml:space="preserve">use </w:t>
+      </w:r>
+      <w:r>
+        <w:rPr>
+          <w:rFonts w:asciiTheme="majorBidi" w:hAnsiTheme="majorBidi" w:cstheme="majorBidi"/>
+          <w:b/>
+          <w:bCs/>
+          <w:i/>
+          <w:iCs/>
+          <w:sz w:val="28"/>
+          <w:szCs w:val="28"/>
+        </w:rPr>
+        <w:t>:</w:t>
+      </w:r>
+      <w:proofErr w:type="gramEnd"/>
+      <w:r>
+        <w:rPr>
+          <w:rFonts w:asciiTheme="majorBidi" w:hAnsiTheme="majorBidi" w:cstheme="majorBidi"/>
+          <w:b/>
+          <w:bCs/>
+          <w:i/>
+          <w:iCs/>
+          <w:sz w:val="28"/>
+          <w:szCs w:val="28"/>
+        </w:rPr>
+        <w:t>Z</w:t>
+      </w:r>
+      <w:r>
+        <w:rPr>
+          <w:rFonts w:asciiTheme="majorBidi" w:hAnsiTheme="majorBidi" w:cstheme="majorBidi"/>
+          <w:sz w:val="28"/>
+          <w:szCs w:val="28"/>
+        </w:rPr>
+        <w:t>.</w:t>
+      </w:r>
+    </w:p>
+    <w:p>
+      <w:pPr>
+        <w:spacing w:after="60"/>
+        <w:ind w:left="360"/>
+        <w:rPr>
+          <w:rFonts w:asciiTheme="majorBidi" w:hAnsiTheme="majorBidi" w:cstheme="majorBidi"/>
+          <w:sz w:val="28"/>
+          <w:szCs w:val="28"/>
+        </w:rPr>
+      </w:pPr>
+      <w:proofErr w:type="gramStart"/>
+      <w:r>
+        <w:rPr>
+          <w:rFonts w:asciiTheme="majorBidi" w:hAnsiTheme="majorBidi" w:cstheme="majorBidi"/>
+          <w:b/>
+          <w:bCs/>
+          <w:i/>
+          <w:iCs/>
+          <w:sz w:val="28"/>
+          <w:szCs w:val="28"/>
+        </w:rPr>
+        <w:t>:Z</w:t>
+      </w:r>
+      <w:proofErr w:type="gramEnd"/>
+      <w:r>
+        <w:rPr>
+          <w:rFonts w:asciiTheme="majorBidi" w:hAnsiTheme="majorBidi" w:cstheme="majorBidi"/>
+          <w:sz w:val="28"/>
+          <w:szCs w:val="28"/>
+        </w:rPr>
+        <w:t xml:space="preserve"> is an </w:t>
+      </w:r>
+      <w:proofErr w:type="spellStart"/>
+      <w:r>
+        <w:rPr>
+          <w:rFonts w:asciiTheme="majorBidi" w:hAnsiTheme="majorBidi" w:cstheme="majorBidi"/>
+          <w:sz w:val="28"/>
+          <w:szCs w:val="28"/>
+        </w:rPr>
+        <w:t>SELinux</w:t>
+      </w:r>
+      <w:proofErr w:type="spellEnd"/>
+      <w:r>
+        <w:rPr>
+          <w:rFonts w:asciiTheme="majorBidi" w:hAnsiTheme="majorBidi" w:cstheme="majorBidi"/>
+          <w:sz w:val="28"/>
+          <w:szCs w:val="28"/>
+        </w:rPr>
+        <w:t xml:space="preserve"> label option for bind mounts. It tells Docker:</w:t>
+      </w:r>
+      <w:r>
+        <w:rPr>
+          <w:rFonts w:asciiTheme="majorBidi" w:hAnsiTheme="majorBidi" w:cstheme="majorBidi"/>
+          <w:sz w:val="28"/>
+          <w:szCs w:val="28"/>
+        </w:rPr>
+        <w:t xml:space="preserve"> </w:t>
+      </w:r>
+      <w:r>
+        <w:rPr>
+          <w:rFonts w:asciiTheme="majorBidi" w:hAnsiTheme="majorBidi" w:cstheme="majorBidi"/>
+          <w:sz w:val="28"/>
+          <w:szCs w:val="28"/>
+        </w:rPr>
+        <w:t>"Relabel this host directory so this container is allowed to access it."</w:t>
+      </w:r>
+    </w:p>
+    <w:p>
+      <w:pPr>
+        <w:spacing w:after="80"/>
+        <w:ind w:left="360"/>
+        <w:rPr>
+          <w:rFonts w:asciiTheme="majorBidi" w:hAnsiTheme="majorBidi" w:cstheme="majorBidi"/>
+          <w:sz w:val="28"/>
+          <w:szCs w:val="28"/>
+        </w:rPr>
+      </w:pPr>
+      <w:r>
+        <w:rPr>
+          <w:rFonts w:asciiTheme="majorBidi" w:hAnsiTheme="majorBidi" w:cstheme="majorBidi"/>
+          <w:sz w:val="28"/>
+          <w:szCs w:val="28"/>
+        </w:rPr>
+        <w:t xml:space="preserve">Without it, </w:t>
+      </w:r>
+      <w:proofErr w:type="spellStart"/>
+      <w:r>
+        <w:rPr>
+          <w:rFonts w:asciiTheme="majorBidi" w:hAnsiTheme="majorBidi" w:cstheme="majorBidi"/>
+          <w:sz w:val="28"/>
+          <w:szCs w:val="28"/>
+        </w:rPr>
+        <w:t>SELinux</w:t>
+      </w:r>
+      <w:proofErr w:type="spellEnd"/>
+      <w:r>
+        <w:rPr>
+          <w:rFonts w:asciiTheme="majorBidi" w:hAnsiTheme="majorBidi" w:cstheme="majorBidi"/>
+          <w:sz w:val="28"/>
+          <w:szCs w:val="28"/>
+        </w:rPr>
+        <w:t xml:space="preserve"> may block the container even if the normal Linux permissions (</w:t>
+      </w:r>
+      <w:proofErr w:type="spellStart"/>
+      <w:r>
+        <w:rPr>
+          <w:rFonts w:asciiTheme="majorBidi" w:hAnsiTheme="majorBidi" w:cstheme="majorBidi"/>
+          <w:sz w:val="28"/>
+          <w:szCs w:val="28"/>
+        </w:rPr>
+        <w:t>rwx</w:t>
+      </w:r>
+      <w:proofErr w:type="spellEnd"/>
+      <w:r>
+        <w:rPr>
+          <w:rFonts w:asciiTheme="majorBidi" w:hAnsiTheme="majorBidi" w:cstheme="majorBidi"/>
+          <w:sz w:val="28"/>
+          <w:szCs w:val="28"/>
+        </w:rPr>
+        <w:t>) look correct.</w:t>
+      </w:r>
+    </w:p>
+    <w:p>
+      <w:pPr>
+        <w:spacing w:after="120"/>
+        <w:ind w:left="360"/>
+        <w:rPr>
+          <w:rFonts w:asciiTheme="majorBidi" w:hAnsiTheme="majorBidi" w:cstheme="majorBidi"/>
+          <w:sz w:val="28"/>
+          <w:szCs w:val="28"/>
+          <w:u w:val="single"/>
+        </w:rPr>
+      </w:pPr>
+      <w:r>
+        <w:rPr>
+          <w:rFonts w:asciiTheme="majorBidi" w:hAnsiTheme="majorBidi" w:cstheme="majorBidi"/>
+          <w:noProof/>
+          <w:sz w:val="28"/>
+          <w:szCs w:val="28"/>
+          <w:u w:val="single"/>
+        </w:rPr>
+        <mc:AlternateContent>
+          <mc:Choice Requires="wps">
+            <w:drawing>
+              <wp:anchor distT="0" distB="0" distL="114300" distR="114300" simplePos="0" relativeHeight="251677696" behindDoc="0" locked="0" layoutInCell="1" allowOverlap="1" wp14:anchorId="0492973B" wp14:editId="025A982C">
+                <wp:simplePos x="0" y="0"/>
+                <wp:positionH relativeFrom="column">
+                  <wp:posOffset>218996</wp:posOffset>
+                </wp:positionH>
+                <wp:positionV relativeFrom="paragraph">
+                  <wp:posOffset>271134</wp:posOffset>
+                </wp:positionV>
+                <wp:extent cx="1951744" cy="583987"/>
+                <wp:effectExtent l="0" t="0" r="10795" b="26035"/>
+                <wp:wrapNone/>
+                <wp:docPr id="139173919" name="Rectangle 16"/>
+                <wp:cNvGraphicFramePr/>
+                <a:graphic xmlns:a="http://schemas.openxmlformats.org/drawingml/2006/main">
+                  <a:graphicData uri="http://schemas.microsoft.com/office/word/2010/wordprocessingShape">
+                    <wps:wsp>
+                      <wps:cNvSpPr/>
+                      <wps:spPr>
+                        <a:xfrm>
+                          <a:off x="0" y="0"/>
+                          <a:ext cx="1951744" cy="583987"/>
+                        </a:xfrm>
+                        <a:prstGeom prst="rect">
+                          <a:avLst/>
+                        </a:prstGeom>
+                      </wps:spPr>
+                      <wps:style>
+                        <a:lnRef idx="2">
+                          <a:schemeClr val="dk1">
+                            <a:shade val="15000"/>
+                          </a:schemeClr>
+                        </a:lnRef>
+                        <a:fillRef idx="1">
+                          <a:schemeClr val="dk1"/>
+                        </a:fillRef>
+                        <a:effectRef idx="0">
+                          <a:schemeClr val="dk1"/>
+                        </a:effectRef>
+                        <a:fontRef idx="minor">
+                          <a:schemeClr val="lt1"/>
+                        </a:fontRef>
+                      </wps:style>
+                      <wps:txbx>
+                        <w:txbxContent>
+                          <w:p>
+                            <w:pPr>
+                              <w:spacing w:after="0"/>
+                              <w:rPr>
+                                <w:rFonts w:asciiTheme="majorBidi" w:hAnsiTheme="majorBidi" w:cstheme="majorBidi"/>
+                                <w:b/>
+                                <w:bCs/>
+                                <w:i/>
+                                <w:iCs/>
+                                <w:sz w:val="28"/>
+                                <w:szCs w:val="28"/>
+                              </w:rPr>
+                            </w:pPr>
+                            <w:r>
+                              <w:rPr>
+                                <w:rFonts w:asciiTheme="majorBidi" w:hAnsiTheme="majorBidi" w:cstheme="majorBidi"/>
+                                <w:b/>
+                                <w:bCs/>
+                                <w:i/>
+                                <w:iCs/>
+                                <w:sz w:val="28"/>
+                                <w:szCs w:val="28"/>
+                              </w:rPr>
+                              <w:t>volumes:</w:t>
+                            </w:r>
+                          </w:p>
+                          <w:p>
+                            <w:pPr>
+                              <w:spacing w:after="0"/>
+                              <w:rPr>
+                                <w:rFonts w:asciiTheme="majorBidi" w:hAnsiTheme="majorBidi" w:cstheme="majorBidi"/>
+                                <w:b/>
+                                <w:bCs/>
+                                <w:i/>
+                                <w:iCs/>
+                                <w:sz w:val="28"/>
+                                <w:szCs w:val="28"/>
+                              </w:rPr>
+                            </w:pPr>
+                            <w:r>
+                              <w:rPr>
+                                <w:rFonts w:asciiTheme="majorBidi" w:hAnsiTheme="majorBidi" w:cstheme="majorBidi"/>
+                                <w:b/>
+                                <w:bCs/>
+                                <w:i/>
+                                <w:iCs/>
+                                <w:sz w:val="28"/>
+                                <w:szCs w:val="28"/>
+                              </w:rPr>
+                              <w:t xml:space="preserve">  </w:t>
+                            </w:r>
+                            <w:proofErr w:type="gramStart"/>
+                            <w:r>
+                              <w:rPr>
+                                <w:rFonts w:asciiTheme="majorBidi" w:hAnsiTheme="majorBidi" w:cstheme="majorBidi"/>
+                                <w:b/>
+                                <w:bCs/>
+                                <w:i/>
+                                <w:iCs/>
+                                <w:sz w:val="28"/>
+                                <w:szCs w:val="28"/>
+                              </w:rPr>
+                              <w:t>- .</w:t>
+                            </w:r>
+                            <w:proofErr w:type="gramEnd"/>
+                            <w:r>
+                              <w:rPr>
+                                <w:rFonts w:asciiTheme="majorBidi" w:hAnsiTheme="majorBidi" w:cstheme="majorBidi"/>
+                                <w:b/>
+                                <w:bCs/>
+                                <w:i/>
+                                <w:iCs/>
+                                <w:sz w:val="28"/>
+                                <w:szCs w:val="28"/>
+                              </w:rPr>
+                              <w:t>/</w:t>
+                            </w:r>
+                            <w:proofErr w:type="gramStart"/>
+                            <w:r>
+                              <w:rPr>
+                                <w:rFonts w:asciiTheme="majorBidi" w:hAnsiTheme="majorBidi" w:cstheme="majorBidi"/>
+                                <w:b/>
+                                <w:bCs/>
+                                <w:i/>
+                                <w:iCs/>
+                                <w:sz w:val="28"/>
+                                <w:szCs w:val="28"/>
+                              </w:rPr>
+                              <w:t>config:/</w:t>
+                            </w:r>
+                            <w:proofErr w:type="spellStart"/>
+                            <w:r>
+                              <w:rPr>
+                                <w:rFonts w:asciiTheme="majorBidi" w:hAnsiTheme="majorBidi" w:cstheme="majorBidi"/>
+                                <w:b/>
+                                <w:bCs/>
+                                <w:i/>
+                                <w:iCs/>
+                                <w:sz w:val="28"/>
+                                <w:szCs w:val="28"/>
+                              </w:rPr>
+                              <w:t>etc</w:t>
+                            </w:r>
+                            <w:proofErr w:type="spellEnd"/>
+                            <w:r>
+                              <w:rPr>
+                                <w:rFonts w:asciiTheme="majorBidi" w:hAnsiTheme="majorBidi" w:cstheme="majorBidi"/>
+                                <w:b/>
+                                <w:bCs/>
+                                <w:i/>
+                                <w:iCs/>
+                                <w:sz w:val="28"/>
+                                <w:szCs w:val="28"/>
+                              </w:rPr>
+                              <w:t>/</w:t>
+                            </w:r>
+                            <w:proofErr w:type="spellStart"/>
+                            <w:r>
+                              <w:rPr>
+                                <w:rFonts w:asciiTheme="majorBidi" w:hAnsiTheme="majorBidi" w:cstheme="majorBidi"/>
+                                <w:b/>
+                                <w:bCs/>
+                                <w:i/>
+                                <w:iCs/>
+                                <w:sz w:val="28"/>
+                                <w:szCs w:val="28"/>
+                              </w:rPr>
+                              <w:t>gitlab:Z</w:t>
+                            </w:r>
+                            <w:proofErr w:type="spellEnd"/>
+                            <w:proofErr w:type="gramEnd"/>
+                          </w:p>
+                          <w:p>
+                            <w:pPr>
+                              <w:spacing w:after="0"/>
+                              <w:jc w:val="center"/>
+                              <w:rPr>
+                                <w:b/>
+                                <w:bCs/>
+                                <w:i/>
+                                <w:iCs/>
+                              </w:rPr>
+                            </w:pPr>
+                          </w:p>
+                        </w:txbxContent>
+                      </wps:txbx>
+                      <wps:bodyPr rot="0" spcFirstLastPara="0" vertOverflow="overflow" horzOverflow="overflow" vert="horz" wrap="square" lIns="91440" tIns="45720" rIns="91440" bIns="45720" numCol="1" spcCol="0" rtlCol="0" fromWordArt="0" anchor="ctr" anchorCtr="0" forceAA="0" compatLnSpc="1">
+                        <a:prstTxWarp prst="textNoShape">
+                          <a:avLst/>
+                        </a:prstTxWarp>
+                        <a:noAutofit/>
+                      </wps:bodyPr>
+                    </wps:wsp>
+                  </a:graphicData>
+                </a:graphic>
+                <wp14:sizeRelH relativeFrom="margin">
+                  <wp14:pctWidth>0</wp14:pctWidth>
+                </wp14:sizeRelH>
+                <wp14:sizeRelV relativeFrom="margin">
+                  <wp14:pctHeight>0</wp14:pctHeight>
+                </wp14:sizeRelV>
+              </wp:anchor>
+            </w:drawing>
+          </mc:Choice>
+          <mc:Fallback>
+            <w:pict>
+              <v:rect w14:anchorId="0492973B" id="Rectangle 16" o:spid="_x0000_s1036" style="position:absolute;left:0;text-align:left;margin-left:17.25pt;margin-top:21.35pt;width:153.7pt;height:46pt;z-index:251677696;visibility:visible;mso-wrap-style:square;mso-width-percent:0;mso-height-percent:0;mso-wrap-distance-left:9pt;mso-wrap-distance-top:0;mso-wrap-distance-right:9pt;mso-wrap-distance-bottom:0;mso-position-horizontal:absolute;mso-position-horizontal-relative:text;mso-position-vertical:absolute;mso-position-vertical-relative:text;mso-width-percent:0;mso-height-percent:0;mso-width-relative:margin;mso-height-relative:margin;v-text-anchor:middle" o:gfxdata="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" fillcolor="black [3200]" strokecolor="black [480]" strokeweight="1pt">
+                <v:textbox>
+                  <w:txbxContent>
+                    <w:p>
+                      <w:pPr>
+                        <w:spacing w:after="0"/>
+                        <w:rPr>
+                          <w:rFonts w:asciiTheme="majorBidi" w:hAnsiTheme="majorBidi" w:cstheme="majorBidi"/>
+                          <w:b/>
+                          <w:bCs/>
+                          <w:i/>
+                          <w:iCs/>
+                          <w:sz w:val="28"/>
+                          <w:szCs w:val="28"/>
+                        </w:rPr>
+                      </w:pPr>
+                      <w:r>
+                        <w:rPr>
+                          <w:rFonts w:asciiTheme="majorBidi" w:hAnsiTheme="majorBidi" w:cstheme="majorBidi"/>
+                          <w:b/>
+                          <w:bCs/>
+                          <w:i/>
+                          <w:iCs/>
+                          <w:sz w:val="28"/>
+                          <w:szCs w:val="28"/>
+                        </w:rPr>
+                        <w:t>volumes:</w:t>
+                      </w:r>
+                    </w:p>
+                    <w:p>
+                      <w:pPr>
+                        <w:spacing w:after="0"/>
+                        <w:rPr>
+                          <w:rFonts w:asciiTheme="majorBidi" w:hAnsiTheme="majorBidi" w:cstheme="majorBidi"/>
+                          <w:b/>
+                          <w:bCs/>
+                          <w:i/>
+                          <w:iCs/>
+                          <w:sz w:val="28"/>
+                          <w:szCs w:val="28"/>
+                        </w:rPr>
+                      </w:pPr>
+                      <w:r>
+                        <w:rPr>
+                          <w:rFonts w:asciiTheme="majorBidi" w:hAnsiTheme="majorBidi" w:cstheme="majorBidi"/>
+                          <w:b/>
+                          <w:bCs/>
+                          <w:i/>
+                          <w:iCs/>
+                          <w:sz w:val="28"/>
+                          <w:szCs w:val="28"/>
+                        </w:rPr>
+                        <w:t xml:space="preserve">  </w:t>
+                      </w:r>
+                      <w:proofErr w:type="gramStart"/>
+                      <w:r>
+                        <w:rPr>
+                          <w:rFonts w:asciiTheme="majorBidi" w:hAnsiTheme="majorBidi" w:cstheme="majorBidi"/>
+                          <w:b/>
+                          <w:bCs/>
+                          <w:i/>
+                          <w:iCs/>
+                          <w:sz w:val="28"/>
+                          <w:szCs w:val="28"/>
+                        </w:rPr>
+                        <w:t>- .</w:t>
+                      </w:r>
+                      <w:proofErr w:type="gramEnd"/>
+                      <w:r>
+                        <w:rPr>
+                          <w:rFonts w:asciiTheme="majorBidi" w:hAnsiTheme="majorBidi" w:cstheme="majorBidi"/>
+                          <w:b/>
+                          <w:bCs/>
+                          <w:i/>
+                          <w:iCs/>
+                          <w:sz w:val="28"/>
+                          <w:szCs w:val="28"/>
+                        </w:rPr>
+                        <w:t>/</w:t>
+                      </w:r>
+                      <w:proofErr w:type="gramStart"/>
+                      <w:r>
+                        <w:rPr>
+                          <w:rFonts w:asciiTheme="majorBidi" w:hAnsiTheme="majorBidi" w:cstheme="majorBidi"/>
+                          <w:b/>
+                          <w:bCs/>
+                          <w:i/>
+                          <w:iCs/>
+                          <w:sz w:val="28"/>
+                          <w:szCs w:val="28"/>
+                        </w:rPr>
+                        <w:t>config:/</w:t>
+                      </w:r>
+                      <w:proofErr w:type="spellStart"/>
+                      <w:r>
+                        <w:rPr>
+                          <w:rFonts w:asciiTheme="majorBidi" w:hAnsiTheme="majorBidi" w:cstheme="majorBidi"/>
+                          <w:b/>
+                          <w:bCs/>
+                          <w:i/>
+                          <w:iCs/>
+                          <w:sz w:val="28"/>
+                          <w:szCs w:val="28"/>
+                        </w:rPr>
+                        <w:t>etc</w:t>
+                      </w:r>
+                      <w:proofErr w:type="spellEnd"/>
+                      <w:r>
+                        <w:rPr>
+                          <w:rFonts w:asciiTheme="majorBidi" w:hAnsiTheme="majorBidi" w:cstheme="majorBidi"/>
+                          <w:b/>
+                          <w:bCs/>
+                          <w:i/>
+                          <w:iCs/>
+                          <w:sz w:val="28"/>
+                          <w:szCs w:val="28"/>
+                        </w:rPr>
+                        <w:t>/</w:t>
+                      </w:r>
+                      <w:proofErr w:type="spellStart"/>
+                      <w:r>
+                        <w:rPr>
+                          <w:rFonts w:asciiTheme="majorBidi" w:hAnsiTheme="majorBidi" w:cstheme="majorBidi"/>
+                          <w:b/>
+                          <w:bCs/>
+                          <w:i/>
+                          <w:iCs/>
+                          <w:sz w:val="28"/>
+                          <w:szCs w:val="28"/>
+                        </w:rPr>
+                        <w:t>gitlab:Z</w:t>
+                      </w:r>
+                      <w:proofErr w:type="spellEnd"/>
+                      <w:proofErr w:type="gramEnd"/>
+                    </w:p>
+                    <w:p>
+                      <w:pPr>
+                        <w:spacing w:after="0"/>
+                        <w:jc w:val="center"/>
+                        <w:rPr>
+                          <w:b/>
+                          <w:bCs/>
+                          <w:i/>
+                          <w:iCs/>
+                        </w:rPr>
+                      </w:pPr>
+                    </w:p>
+                  </w:txbxContent>
+                </v:textbox>
+              </v:rect>
+            </w:pict>
+          </mc:Fallback>
+        </mc:AlternateContent>
+      </w:r>
+      <w:r>
+        <w:rPr>
+          <w:rFonts w:asciiTheme="majorBidi" w:hAnsiTheme="majorBidi" w:cstheme="majorBidi"/>
+          <w:sz w:val="28"/>
+          <w:szCs w:val="28"/>
+          <w:u w:val="single"/>
+        </w:rPr>
+        <w:t>For example:</w:t>
+      </w:r>
+    </w:p>
+    <w:p>
+      <w:pPr>
+        <w:spacing w:after="120"/>
+        <w:rPr>
+          <w:rFonts w:asciiTheme="majorBidi" w:hAnsiTheme="majorBidi" w:cstheme="majorBidi"/>
+          <w:sz w:val="28"/>
+          <w:szCs w:val="28"/>
+        </w:rPr>
+      </w:pPr>
+    </w:p>
+    <w:p>
+      <w:pPr>
+        <w:spacing w:after="120"/>
+        <w:rPr>
+          <w:rFonts w:asciiTheme="majorBidi" w:hAnsiTheme="majorBidi" w:cstheme="majorBidi"/>
+          <w:sz w:val="28"/>
+          <w:szCs w:val="28"/>
+        </w:rPr>
+      </w:pPr>
+    </w:p>
+    <w:p>
+      <w:pPr>
         <w:spacing w:after="60"/>
         <w:rPr>
           <w:rFonts w:asciiTheme="majorBidi" w:hAnsiTheme="majorBidi" w:cstheme="majorBidi"/>
@@ -25946,6 +26582,7 @@
         <w:t xml:space="preserve"> vs </w:t>
       </w:r>
       <w:proofErr w:type="spellStart"/>
+      <w:proofErr w:type="gramStart"/>
       <w:r>
         <w:rPr>
           <w:rFonts w:asciiTheme="majorBidi" w:hAnsiTheme="majorBidi" w:cstheme="majorBidi"/>
@@ -25956,7 +26593,20 @@
           <w:sz w:val="32"/>
           <w:szCs w:val="32"/>
         </w:rPr>
-        <w:t>deploy.</w:t>
+        <w:t>deploy</w:t>
+      </w:r>
+      <w:proofErr w:type="gramEnd"/>
+      <w:r>
+        <w:rPr>
+          <w:rFonts w:asciiTheme="majorBidi" w:hAnsiTheme="majorBidi" w:cstheme="majorBidi"/>
+          <w:b/>
+          <w:bCs/>
+          <w:i/>
+          <w:iCs/>
+          <w:sz w:val="32"/>
+          <w:szCs w:val="32"/>
+        </w:rPr>
+        <w:t>.</w:t>
       </w:r>
       <w:proofErr w:type="gramStart"/>
       <w:r>
@@ -26387,7 +27037,7 @@
           </mc:Choice>
           <mc:Fallback>
             <w:pict>
-              <v:rect w14:anchorId="2B2F6FAB" id="Rectangle 11" o:spid="_x0000_s1036" style="position:absolute;left:0;text-align:left;margin-left:18pt;margin-top:20.5pt;width:198.6pt;height:100.8pt;z-index:251671552;visibility:visible;mso-wrap-style:square;mso-width-percent:0;mso-height-percent:0;mso-wrap-distance-left:9pt;mso-wrap-distance-top:0;mso-wrap-distance-right:9pt;mso-wrap-distance-bottom:0;mso-position-horizontal:absolute;mso-position-horizontal-relative:text;mso-position-vertical:absolute;mso-position-vertical-relative:text;mso-width-percent:0;mso-height-percent:0;mso-width-relative:margin;mso-height-relative:margin;v-text-anchor:middle" o:gfxdata="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" fillcolor="black [3200]" strokecolor="black [480]" strokeweight="1pt">
+              <v:rect w14:anchorId="2B2F6FAB" id="Rectangle 11" o:spid="_x0000_s1037" style="position:absolute;left:0;text-align:left;margin-left:18pt;margin-top:20.5pt;width:198.6pt;height:100.8pt;z-index:251671552;visibility:visible;mso-wrap-style:square;mso-width-percent:0;mso-height-percent:0;mso-wrap-distance-left:9pt;mso-wrap-distance-top:0;mso-wrap-distance-right:9pt;mso-wrap-distance-bottom:0;mso-position-horizontal:absolute;mso-position-horizontal-relative:text;mso-position-vertical:absolute;mso-position-vertical-relative:text;mso-width-percent:0;mso-height-percent:0;mso-width-relative:margin;mso-height-relative:margin;v-text-anchor:middle" o:gfxdata="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" fillcolor="black [3200]" strokecolor="black [480]" strokeweight="1pt">
                 <v:textbox>
                   <w:txbxContent>
                     <w:p>
@@ -27198,25 +27848,6 @@
       <w:r>
         <w:rPr>
           <w:rFonts w:asciiTheme="majorBidi" w:hAnsiTheme="majorBidi" w:cstheme="majorBidi"/>
-          <w:sz w:val="28"/>
-          <w:szCs w:val="28"/>
-          <w:u w:val="single"/>
-        </w:rPr>
-        <w:t>Example of the Modern Standard (Swarm Ready):</w:t>
-      </w:r>
-    </w:p>
-    <w:p>
-      <w:pPr>
-        <w:ind w:left="360"/>
-        <w:rPr>
-          <w:rFonts w:asciiTheme="majorBidi" w:hAnsiTheme="majorBidi" w:cstheme="majorBidi"/>
-          <w:sz w:val="28"/>
-          <w:szCs w:val="28"/>
-        </w:rPr>
-      </w:pPr>
-      <w:r>
-        <w:rPr>
-          <w:rFonts w:asciiTheme="majorBidi" w:hAnsiTheme="majorBidi" w:cstheme="majorBidi"/>
           <w:noProof/>
           <w:sz w:val="28"/>
           <w:szCs w:val="28"/>
@@ -27224,18 +27855,18 @@
         <mc:AlternateContent>
           <mc:Choice Requires="wps">
             <w:drawing>
-              <wp:anchor distT="0" distB="0" distL="114300" distR="114300" simplePos="0" relativeHeight="251672576" behindDoc="0" locked="0" layoutInCell="1" allowOverlap="1" wp14:anchorId="779E12F5" wp14:editId="53447BA2">
+              <wp:anchor distT="0" distB="0" distL="114300" distR="114300" simplePos="0" relativeHeight="251679744" behindDoc="0" locked="0" layoutInCell="1" allowOverlap="1" wp14:anchorId="4AF0DD11" wp14:editId="33606432">
                 <wp:simplePos x="0" y="0"/>
-                <wp:positionH relativeFrom="column">
-                  <wp:posOffset>228600</wp:posOffset>
+                <wp:positionH relativeFrom="margin">
+                  <wp:posOffset>249731</wp:posOffset>
                 </wp:positionH>
                 <wp:positionV relativeFrom="paragraph">
-                  <wp:posOffset>8889</wp:posOffset>
+                  <wp:posOffset>279176</wp:posOffset>
                 </wp:positionV>
-                <wp:extent cx="2522220" cy="2714625"/>
-                <wp:effectExtent l="0" t="0" r="11430" b="28575"/>
+                <wp:extent cx="2522220" cy="630091"/>
+                <wp:effectExtent l="0" t="0" r="11430" b="17780"/>
                 <wp:wrapNone/>
-                <wp:docPr id="750051838" name="Rectangle 12"/>
+                <wp:docPr id="860296460" name="Rectangle 12"/>
                 <wp:cNvGraphicFramePr/>
                 <a:graphic xmlns:a="http://schemas.openxmlformats.org/drawingml/2006/main">
                   <a:graphicData uri="http://schemas.microsoft.com/office/word/2010/wordprocessingShape">
@@ -27244,7 +27875,7 @@
                       <wps:spPr>
                         <a:xfrm>
                           <a:off x="0" y="0"/>
-                          <a:ext cx="2522220" cy="2714625"/>
+                          <a:ext cx="2522220" cy="630091"/>
                         </a:xfrm>
                         <a:prstGeom prst="rect">
                           <a:avLst/>
@@ -27346,6 +27977,209 @@
                               <w:t>:</w:t>
                             </w:r>
                           </w:p>
+                        </w:txbxContent>
+                      </wps:txbx>
+                      <wps:bodyPr rot="0" spcFirstLastPara="0" vertOverflow="overflow" horzOverflow="overflow" vert="horz" wrap="square" lIns="91440" tIns="45720" rIns="91440" bIns="45720" numCol="1" spcCol="0" rtlCol="0" fromWordArt="0" anchor="ctr" anchorCtr="0" forceAA="0" compatLnSpc="1">
+                        <a:prstTxWarp prst="textNoShape">
+                          <a:avLst/>
+                        </a:prstTxWarp>
+                        <a:noAutofit/>
+                      </wps:bodyPr>
+                    </wps:wsp>
+                  </a:graphicData>
+                </a:graphic>
+                <wp14:sizeRelH relativeFrom="margin">
+                  <wp14:pctWidth>0</wp14:pctWidth>
+                </wp14:sizeRelH>
+                <wp14:sizeRelV relativeFrom="margin">
+                  <wp14:pctHeight>0</wp14:pctHeight>
+                </wp14:sizeRelV>
+              </wp:anchor>
+            </w:drawing>
+          </mc:Choice>
+          <mc:Fallback>
+            <w:pict>
+              <v:rect w14:anchorId="4AF0DD11" id="Rectangle 12" o:spid="_x0000_s1038" style="position:absolute;left:0;text-align:left;margin-left:19.65pt;margin-top:22pt;width:198.6pt;height:49.6pt;z-index:251679744;visibility:visible;mso-wrap-style:square;mso-width-percent:0;mso-height-percent:0;mso-wrap-distance-left:9pt;mso-wrap-distance-top:0;mso-wrap-distance-right:9pt;mso-wrap-distance-bottom:0;mso-position-horizontal:absolute;mso-position-horizontal-relative:margin;mso-position-vertical:absolute;mso-position-vertical-relative:text;mso-width-percent:0;mso-height-percent:0;mso-width-relative:margin;mso-height-relative:margin;v-text-anchor:middle" o:gfxdata="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" fillcolor="black [3200]" strokecolor="black [480]" strokeweight="1pt">
+                <v:textbox>
+                  <w:txbxContent>
+                    <w:p>
+                      <w:pPr>
+                        <w:spacing w:after="0"/>
+                        <w:rPr>
+                          <w:rFonts w:asciiTheme="majorBidi" w:hAnsiTheme="majorBidi" w:cstheme="majorBidi"/>
+                          <w:b/>
+                          <w:bCs/>
+                          <w:i/>
+                          <w:iCs/>
+                          <w:sz w:val="28"/>
+                          <w:szCs w:val="28"/>
+                        </w:rPr>
+                      </w:pPr>
+                      <w:r>
+                        <w:rPr>
+                          <w:rFonts w:asciiTheme="majorBidi" w:hAnsiTheme="majorBidi" w:cstheme="majorBidi"/>
+                          <w:b/>
+                          <w:bCs/>
+                          <w:i/>
+                          <w:iCs/>
+                          <w:sz w:val="28"/>
+                          <w:szCs w:val="28"/>
+                        </w:rPr>
+                        <w:t>services:</w:t>
+                      </w:r>
+                    </w:p>
+                    <w:p>
+                      <w:pPr>
+                        <w:spacing w:after="0"/>
+                        <w:rPr>
+                          <w:rFonts w:asciiTheme="majorBidi" w:hAnsiTheme="majorBidi" w:cstheme="majorBidi"/>
+                          <w:b/>
+                          <w:bCs/>
+                          <w:i/>
+                          <w:iCs/>
+                          <w:sz w:val="28"/>
+                          <w:szCs w:val="28"/>
+                        </w:rPr>
+                      </w:pPr>
+                      <w:r>
+                        <w:rPr>
+                          <w:rFonts w:asciiTheme="majorBidi" w:hAnsiTheme="majorBidi" w:cstheme="majorBidi"/>
+                          <w:b/>
+                          <w:bCs/>
+                          <w:i/>
+                          <w:iCs/>
+                          <w:sz w:val="28"/>
+                          <w:szCs w:val="28"/>
+                        </w:rPr>
+                        <w:t xml:space="preserve">     </w:t>
+                      </w:r>
+                      <w:proofErr w:type="spellStart"/>
+                      <w:r>
+                        <w:rPr>
+                          <w:rFonts w:asciiTheme="majorBidi" w:hAnsiTheme="majorBidi" w:cstheme="majorBidi"/>
+                          <w:b/>
+                          <w:bCs/>
+                          <w:i/>
+                          <w:iCs/>
+                          <w:sz w:val="28"/>
+                          <w:szCs w:val="28"/>
+                        </w:rPr>
+                        <w:t>api</w:t>
+                      </w:r>
+                      <w:proofErr w:type="spellEnd"/>
+                      <w:r>
+                        <w:rPr>
+                          <w:rFonts w:asciiTheme="majorBidi" w:hAnsiTheme="majorBidi" w:cstheme="majorBidi"/>
+                          <w:b/>
+                          <w:bCs/>
+                          <w:i/>
+                          <w:iCs/>
+                          <w:sz w:val="28"/>
+                          <w:szCs w:val="28"/>
+                        </w:rPr>
+                        <w:t>:</w:t>
+                      </w:r>
+                    </w:p>
+                  </w:txbxContent>
+                </v:textbox>
+                <w10:wrap anchorx="margin"/>
+              </v:rect>
+            </w:pict>
+          </mc:Fallback>
+        </mc:AlternateContent>
+      </w:r>
+      <w:r>
+        <w:rPr>
+          <w:rFonts w:asciiTheme="majorBidi" w:hAnsiTheme="majorBidi" w:cstheme="majorBidi"/>
+          <w:sz w:val="28"/>
+          <w:szCs w:val="28"/>
+          <w:u w:val="single"/>
+        </w:rPr>
+        <w:t>Example of the Modern Standard (Swarm Ready):</w:t>
+      </w:r>
+    </w:p>
+    <w:p>
+      <w:pPr>
+        <w:ind w:left="360"/>
+        <w:rPr>
+          <w:rFonts w:asciiTheme="majorBidi" w:hAnsiTheme="majorBidi" w:cstheme="majorBidi"/>
+          <w:sz w:val="28"/>
+          <w:szCs w:val="28"/>
+        </w:rPr>
+      </w:pPr>
+    </w:p>
+    <w:p>
+      <w:pPr>
+        <w:rPr>
+          <w:rFonts w:asciiTheme="majorBidi" w:hAnsiTheme="majorBidi" w:cstheme="majorBidi"/>
+          <w:sz w:val="28"/>
+          <w:szCs w:val="28"/>
+        </w:rPr>
+      </w:pPr>
+    </w:p>
+    <w:p>
+      <w:pPr>
+        <w:rPr>
+          <w:rFonts w:asciiTheme="majorBidi" w:hAnsiTheme="majorBidi" w:cstheme="majorBidi"/>
+          <w:sz w:val="28"/>
+          <w:szCs w:val="28"/>
+        </w:rPr>
+      </w:pPr>
+      <w:r>
+        <w:rPr>
+          <w:rFonts w:asciiTheme="majorBidi" w:hAnsiTheme="majorBidi" w:cstheme="majorBidi"/>
+          <w:noProof/>
+          <w:sz w:val="28"/>
+          <w:szCs w:val="28"/>
+        </w:rPr>
+        <w:lastRenderedPageBreak/>
+        <mc:AlternateContent>
+          <mc:Choice Requires="wps">
+            <w:drawing>
+              <wp:anchor distT="0" distB="0" distL="114300" distR="114300" simplePos="0" relativeHeight="251672576" behindDoc="0" locked="0" layoutInCell="1" allowOverlap="1" wp14:anchorId="779E12F5" wp14:editId="081FCEE2">
+                <wp:simplePos x="0" y="0"/>
+                <wp:positionH relativeFrom="margin">
+                  <wp:align>left</wp:align>
+                </wp:positionH>
+                <wp:positionV relativeFrom="paragraph">
+                  <wp:posOffset>-363</wp:posOffset>
+                </wp:positionV>
+                <wp:extent cx="2522220" cy="2205318"/>
+                <wp:effectExtent l="0" t="0" r="11430" b="24130"/>
+                <wp:wrapNone/>
+                <wp:docPr id="750051838" name="Rectangle 12"/>
+                <wp:cNvGraphicFramePr/>
+                <a:graphic xmlns:a="http://schemas.openxmlformats.org/drawingml/2006/main">
+                  <a:graphicData uri="http://schemas.microsoft.com/office/word/2010/wordprocessingShape">
+                    <wps:wsp>
+                      <wps:cNvSpPr/>
+                      <wps:spPr>
+                        <a:xfrm>
+                          <a:off x="0" y="0"/>
+                          <a:ext cx="2522220" cy="2205318"/>
+                        </a:xfrm>
+                        <a:prstGeom prst="rect">
+                          <a:avLst/>
+                        </a:prstGeom>
+                      </wps:spPr>
+                      <wps:style>
+                        <a:lnRef idx="2">
+                          <a:schemeClr val="dk1">
+                            <a:shade val="15000"/>
+                          </a:schemeClr>
+                        </a:lnRef>
+                        <a:fillRef idx="1">
+                          <a:schemeClr val="dk1"/>
+                        </a:fillRef>
+                        <a:effectRef idx="0">
+                          <a:schemeClr val="dk1"/>
+                        </a:effectRef>
+                        <a:fontRef idx="minor">
+                          <a:schemeClr val="lt1"/>
+                        </a:fontRef>
+                      </wps:style>
+                      <wps:txbx>
+                        <w:txbxContent>
                           <w:p>
                             <w:pPr>
                               <w:spacing w:after="0"/>
@@ -27738,7 +28572,7 @@
           </mc:Choice>
           <mc:Fallback>
             <w:pict>
-              <v:rect w14:anchorId="779E12F5" id="Rectangle 12" o:spid="_x0000_s1037" style="position:absolute;left:0;text-align:left;margin-left:18pt;margin-top:.7pt;width:198.6pt;height:213.75pt;z-index:251672576;visibility:visible;mso-wrap-style:square;mso-width-percent:0;mso-height-percent:0;mso-wrap-distance-left:9pt;mso-wrap-distance-top:0;mso-wrap-distance-right:9pt;mso-wrap-distance-bottom:0;mso-position-horizontal:absolute;mso-position-horizontal-relative:text;mso-position-vertical:absolute;mso-position-vertical-relative:text;mso-width-percent:0;mso-height-percent:0;mso-width-relative:margin;mso-height-relative:margin;v-text-anchor:middle" o:gfxdata="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" fillcolor="black [3200]" strokecolor="black [480]" strokeweight="1pt">
+              <v:rect w14:anchorId="779E12F5" id="_x0000_s1039" style="position:absolute;margin-left:0;margin-top:-.05pt;width:198.6pt;height:173.65pt;z-index:251672576;visibility:visible;mso-wrap-style:square;mso-width-percent:0;mso-height-percent:0;mso-wrap-distance-left:9pt;mso-wrap-distance-top:0;mso-wrap-distance-right:9pt;mso-wrap-distance-bottom:0;mso-position-horizontal:left;mso-position-horizontal-relative:margin;mso-position-vertical:absolute;mso-position-vertical-relative:text;mso-width-percent:0;mso-height-percent:0;mso-width-relative:margin;mso-height-relative:margin;v-text-anchor:middle" o:gfxdata="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" fillcolor="black [3200]" strokecolor="black [480]" strokeweight="1pt">
                 <v:textbox>
                   <w:txbxContent>
                     <w:p>
@@ -27764,7 +28598,19 @@
                           <w:sz w:val="28"/>
                           <w:szCs w:val="28"/>
                         </w:rPr>
-                        <w:t>services:</w:t>
+                        <w:t xml:space="preserve">          </w:t>
+                      </w:r>
+                      <w:r>
+                        <w:rPr>
+                          <w:rFonts w:asciiTheme="majorBidi" w:hAnsiTheme="majorBidi" w:cstheme="majorBidi"/>
+                          <w:b/>
+                          <w:bCs/>
+                          <w:i/>
+                          <w:iCs/>
+                          <w:sz w:val="28"/>
+                          <w:szCs w:val="28"/>
+                        </w:rPr>
+                        <w:t>image: node:18</w:t>
                       </w:r>
                     </w:p>
                     <w:p>
@@ -27790,33 +28636,19 @@
                           <w:sz w:val="28"/>
                           <w:szCs w:val="28"/>
                         </w:rPr>
-                        <w:t xml:space="preserve">     </w:t>
-                      </w:r>
-                      <w:proofErr w:type="spellStart"/>
-                      <w:r>
-                        <w:rPr>
-                          <w:rFonts w:asciiTheme="majorBidi" w:hAnsiTheme="majorBidi" w:cstheme="majorBidi"/>
-                          <w:b/>
-                          <w:bCs/>
-                          <w:i/>
-                          <w:iCs/>
-                          <w:sz w:val="28"/>
-                          <w:szCs w:val="28"/>
-                        </w:rPr>
-                        <w:t>api</w:t>
-                      </w:r>
-                      <w:proofErr w:type="spellEnd"/>
-                      <w:r>
-                        <w:rPr>
-                          <w:rFonts w:asciiTheme="majorBidi" w:hAnsiTheme="majorBidi" w:cstheme="majorBidi"/>
-                          <w:b/>
-                          <w:bCs/>
-                          <w:i/>
-                          <w:iCs/>
-                          <w:sz w:val="28"/>
-                          <w:szCs w:val="28"/>
-                        </w:rPr>
-                        <w:t>:</w:t>
+                        <w:t xml:space="preserve">          </w:t>
+                      </w:r>
+                      <w:r>
+                        <w:rPr>
+                          <w:rFonts w:asciiTheme="majorBidi" w:hAnsiTheme="majorBidi" w:cstheme="majorBidi"/>
+                          <w:b/>
+                          <w:bCs/>
+                          <w:i/>
+                          <w:iCs/>
+                          <w:sz w:val="28"/>
+                          <w:szCs w:val="28"/>
+                        </w:rPr>
+                        <w:t>deploy:</w:t>
                       </w:r>
                     </w:p>
                     <w:p>
@@ -27842,19 +28674,19 @@
                           <w:sz w:val="28"/>
                           <w:szCs w:val="28"/>
                         </w:rPr>
-                        <w:t xml:space="preserve">          </w:t>
-                      </w:r>
-                      <w:r>
-                        <w:rPr>
-                          <w:rFonts w:asciiTheme="majorBidi" w:hAnsiTheme="majorBidi" w:cstheme="majorBidi"/>
-                          <w:b/>
-                          <w:bCs/>
-                          <w:i/>
-                          <w:iCs/>
-                          <w:sz w:val="28"/>
-                          <w:szCs w:val="28"/>
-                        </w:rPr>
-                        <w:t>image: node:18</w:t>
+                        <w:t xml:space="preserve">               </w:t>
+                      </w:r>
+                      <w:r>
+                        <w:rPr>
+                          <w:rFonts w:asciiTheme="majorBidi" w:hAnsiTheme="majorBidi" w:cstheme="majorBidi"/>
+                          <w:b/>
+                          <w:bCs/>
+                          <w:i/>
+                          <w:iCs/>
+                          <w:sz w:val="28"/>
+                          <w:szCs w:val="28"/>
+                        </w:rPr>
+                        <w:t>resources:</w:t>
                       </w:r>
                     </w:p>
                     <w:p>
@@ -27880,19 +28712,19 @@
                           <w:sz w:val="28"/>
                           <w:szCs w:val="28"/>
                         </w:rPr>
-                        <w:t xml:space="preserve">          </w:t>
-                      </w:r>
-                      <w:r>
-                        <w:rPr>
-                          <w:rFonts w:asciiTheme="majorBidi" w:hAnsiTheme="majorBidi" w:cstheme="majorBidi"/>
-                          <w:b/>
-                          <w:bCs/>
-                          <w:i/>
-                          <w:iCs/>
-                          <w:sz w:val="28"/>
-                          <w:szCs w:val="28"/>
-                        </w:rPr>
-                        <w:t>deploy:</w:t>
+                        <w:t xml:space="preserve">                    </w:t>
+                      </w:r>
+                      <w:r>
+                        <w:rPr>
+                          <w:rFonts w:asciiTheme="majorBidi" w:hAnsiTheme="majorBidi" w:cstheme="majorBidi"/>
+                          <w:b/>
+                          <w:bCs/>
+                          <w:i/>
+                          <w:iCs/>
+                          <w:sz w:val="28"/>
+                          <w:szCs w:val="28"/>
+                        </w:rPr>
+                        <w:t>limits:</w:t>
                       </w:r>
                     </w:p>
                     <w:p>
@@ -27918,19 +28750,33 @@
                           <w:sz w:val="28"/>
                           <w:szCs w:val="28"/>
                         </w:rPr>
-                        <w:t xml:space="preserve">               </w:t>
-                      </w:r>
-                      <w:r>
-                        <w:rPr>
-                          <w:rFonts w:asciiTheme="majorBidi" w:hAnsiTheme="majorBidi" w:cstheme="majorBidi"/>
-                          <w:b/>
-                          <w:bCs/>
-                          <w:i/>
-                          <w:iCs/>
-                          <w:sz w:val="28"/>
-                          <w:szCs w:val="28"/>
-                        </w:rPr>
-                        <w:t>resources:</w:t>
+                        <w:t xml:space="preserve">                         </w:t>
+                      </w:r>
+                      <w:proofErr w:type="spellStart"/>
+                      <w:r>
+                        <w:rPr>
+                          <w:rFonts w:asciiTheme="majorBidi" w:hAnsiTheme="majorBidi" w:cstheme="majorBidi"/>
+                          <w:b/>
+                          <w:bCs/>
+                          <w:i/>
+                          <w:iCs/>
+                          <w:sz w:val="28"/>
+                          <w:szCs w:val="28"/>
+                        </w:rPr>
+                        <w:t>cpus</w:t>
+                      </w:r>
+                      <w:proofErr w:type="spellEnd"/>
+                      <w:r>
+                        <w:rPr>
+                          <w:rFonts w:asciiTheme="majorBidi" w:hAnsiTheme="majorBidi" w:cstheme="majorBidi"/>
+                          <w:b/>
+                          <w:bCs/>
+                          <w:i/>
+                          <w:iCs/>
+                          <w:sz w:val="28"/>
+                          <w:szCs w:val="28"/>
+                        </w:rPr>
+                        <w:t>: '0.5'</w:t>
                       </w:r>
                     </w:p>
                     <w:p>
@@ -27956,19 +28802,19 @@
                           <w:sz w:val="28"/>
                           <w:szCs w:val="28"/>
                         </w:rPr>
-                        <w:t xml:space="preserve">                    </w:t>
-                      </w:r>
-                      <w:r>
-                        <w:rPr>
-                          <w:rFonts w:asciiTheme="majorBidi" w:hAnsiTheme="majorBidi" w:cstheme="majorBidi"/>
-                          <w:b/>
-                          <w:bCs/>
-                          <w:i/>
-                          <w:iCs/>
-                          <w:sz w:val="28"/>
-                          <w:szCs w:val="28"/>
-                        </w:rPr>
-                        <w:t>limits:</w:t>
+                        <w:t xml:space="preserve">                         </w:t>
+                      </w:r>
+                      <w:r>
+                        <w:rPr>
+                          <w:rFonts w:asciiTheme="majorBidi" w:hAnsiTheme="majorBidi" w:cstheme="majorBidi"/>
+                          <w:b/>
+                          <w:bCs/>
+                          <w:i/>
+                          <w:iCs/>
+                          <w:sz w:val="28"/>
+                          <w:szCs w:val="28"/>
+                        </w:rPr>
+                        <w:t>memory: 512M</w:t>
                       </w:r>
                     </w:p>
                     <w:p>
@@ -27994,33 +28840,19 @@
                           <w:sz w:val="28"/>
                           <w:szCs w:val="28"/>
                         </w:rPr>
-                        <w:t xml:space="preserve">                         </w:t>
-                      </w:r>
-                      <w:proofErr w:type="spellStart"/>
-                      <w:r>
-                        <w:rPr>
-                          <w:rFonts w:asciiTheme="majorBidi" w:hAnsiTheme="majorBidi" w:cstheme="majorBidi"/>
-                          <w:b/>
-                          <w:bCs/>
-                          <w:i/>
-                          <w:iCs/>
-                          <w:sz w:val="28"/>
-                          <w:szCs w:val="28"/>
-                        </w:rPr>
-                        <w:t>cpus</w:t>
-                      </w:r>
-                      <w:proofErr w:type="spellEnd"/>
-                      <w:r>
-                        <w:rPr>
-                          <w:rFonts w:asciiTheme="majorBidi" w:hAnsiTheme="majorBidi" w:cstheme="majorBidi"/>
-                          <w:b/>
-                          <w:bCs/>
-                          <w:i/>
-                          <w:iCs/>
-                          <w:sz w:val="28"/>
-                          <w:szCs w:val="28"/>
-                        </w:rPr>
-                        <w:t>: '0.5'</w:t>
+                        <w:t xml:space="preserve">                    </w:t>
+                      </w:r>
+                      <w:r>
+                        <w:rPr>
+                          <w:rFonts w:asciiTheme="majorBidi" w:hAnsiTheme="majorBidi" w:cstheme="majorBidi"/>
+                          <w:b/>
+                          <w:bCs/>
+                          <w:i/>
+                          <w:iCs/>
+                          <w:sz w:val="28"/>
+                          <w:szCs w:val="28"/>
+                        </w:rPr>
+                        <w:t>reservations:</w:t>
                       </w:r>
                     </w:p>
                     <w:p>
@@ -28048,17 +28880,31 @@
                         </w:rPr>
                         <w:t xml:space="preserve">                         </w:t>
                       </w:r>
-                      <w:r>
-                        <w:rPr>
-                          <w:rFonts w:asciiTheme="majorBidi" w:hAnsiTheme="majorBidi" w:cstheme="majorBidi"/>
-                          <w:b/>
-                          <w:bCs/>
-                          <w:i/>
-                          <w:iCs/>
-                          <w:sz w:val="28"/>
-                          <w:szCs w:val="28"/>
-                        </w:rPr>
-                        <w:t>memory: 512M</w:t>
+                      <w:proofErr w:type="spellStart"/>
+                      <w:r>
+                        <w:rPr>
+                          <w:rFonts w:asciiTheme="majorBidi" w:hAnsiTheme="majorBidi" w:cstheme="majorBidi"/>
+                          <w:b/>
+                          <w:bCs/>
+                          <w:i/>
+                          <w:iCs/>
+                          <w:sz w:val="28"/>
+                          <w:szCs w:val="28"/>
+                        </w:rPr>
+                        <w:t>cpus</w:t>
+                      </w:r>
+                      <w:proofErr w:type="spellEnd"/>
+                      <w:r>
+                        <w:rPr>
+                          <w:rFonts w:asciiTheme="majorBidi" w:hAnsiTheme="majorBidi" w:cstheme="majorBidi"/>
+                          <w:b/>
+                          <w:bCs/>
+                          <w:i/>
+                          <w:iCs/>
+                          <w:sz w:val="28"/>
+                          <w:szCs w:val="28"/>
+                        </w:rPr>
+                        <w:t>: '0.25'</w:t>
                       </w:r>
                     </w:p>
                     <w:p>
@@ -28084,96 +28930,6 @@
                           <w:sz w:val="28"/>
                           <w:szCs w:val="28"/>
                         </w:rPr>
-                        <w:t xml:space="preserve">                    </w:t>
-                      </w:r>
-                      <w:r>
-                        <w:rPr>
-                          <w:rFonts w:asciiTheme="majorBidi" w:hAnsiTheme="majorBidi" w:cstheme="majorBidi"/>
-                          <w:b/>
-                          <w:bCs/>
-                          <w:i/>
-                          <w:iCs/>
-                          <w:sz w:val="28"/>
-                          <w:szCs w:val="28"/>
-                        </w:rPr>
-                        <w:t>reservations:</w:t>
-                      </w:r>
-                    </w:p>
-                    <w:p>
-                      <w:pPr>
-                        <w:spacing w:after="0"/>
-                        <w:rPr>
-                          <w:rFonts w:asciiTheme="majorBidi" w:hAnsiTheme="majorBidi" w:cstheme="majorBidi"/>
-                          <w:b/>
-                          <w:bCs/>
-                          <w:i/>
-                          <w:iCs/>
-                          <w:sz w:val="28"/>
-                          <w:szCs w:val="28"/>
-                        </w:rPr>
-                      </w:pPr>
-                      <w:r>
-                        <w:rPr>
-                          <w:rFonts w:asciiTheme="majorBidi" w:hAnsiTheme="majorBidi" w:cstheme="majorBidi"/>
-                          <w:b/>
-                          <w:bCs/>
-                          <w:i/>
-                          <w:iCs/>
-                          <w:sz w:val="28"/>
-                          <w:szCs w:val="28"/>
-                        </w:rPr>
-                        <w:t xml:space="preserve">                         </w:t>
-                      </w:r>
-                      <w:proofErr w:type="spellStart"/>
-                      <w:r>
-                        <w:rPr>
-                          <w:rFonts w:asciiTheme="majorBidi" w:hAnsiTheme="majorBidi" w:cstheme="majorBidi"/>
-                          <w:b/>
-                          <w:bCs/>
-                          <w:i/>
-                          <w:iCs/>
-                          <w:sz w:val="28"/>
-                          <w:szCs w:val="28"/>
-                        </w:rPr>
-                        <w:t>cpus</w:t>
-                      </w:r>
-                      <w:proofErr w:type="spellEnd"/>
-                      <w:r>
-                        <w:rPr>
-                          <w:rFonts w:asciiTheme="majorBidi" w:hAnsiTheme="majorBidi" w:cstheme="majorBidi"/>
-                          <w:b/>
-                          <w:bCs/>
-                          <w:i/>
-                          <w:iCs/>
-                          <w:sz w:val="28"/>
-                          <w:szCs w:val="28"/>
-                        </w:rPr>
-                        <w:t>: '0.25'</w:t>
-                      </w:r>
-                    </w:p>
-                    <w:p>
-                      <w:pPr>
-                        <w:spacing w:after="0"/>
-                        <w:rPr>
-                          <w:rFonts w:asciiTheme="majorBidi" w:hAnsiTheme="majorBidi" w:cstheme="majorBidi"/>
-                          <w:b/>
-                          <w:bCs/>
-                          <w:i/>
-                          <w:iCs/>
-                          <w:sz w:val="28"/>
-                          <w:szCs w:val="28"/>
-                        </w:rPr>
-                      </w:pPr>
-                      <w:r>
-                        <w:rPr>
-                          <w:rFonts w:asciiTheme="majorBidi" w:hAnsiTheme="majorBidi" w:cstheme="majorBidi"/>
-                          <w:b/>
-                          <w:bCs/>
-                          <w:i/>
-                          <w:iCs/>
-                          <w:sz w:val="28"/>
-                          <w:szCs w:val="28"/>
-                        </w:rPr>
                         <w:t xml:space="preserve">                         </w:t>
                       </w:r>
                       <w:r>
@@ -28191,6 +28947,7 @@
                     </w:p>
                   </w:txbxContent>
                 </v:textbox>
+                <w10:wrap anchorx="margin"/>
               </v:rect>
             </w:pict>
           </mc:Fallback>
@@ -28246,17 +29003,8 @@
       <w:pPr>
         <w:rPr>
           <w:rFonts w:asciiTheme="majorBidi" w:hAnsiTheme="majorBidi" w:cstheme="majorBidi"/>
-          <w:sz w:val="28"/>
-          <w:szCs w:val="28"/>
-        </w:rPr>
-      </w:pPr>
-    </w:p>
-    <w:p>
-      <w:pPr>
-        <w:rPr>
-          <w:rFonts w:asciiTheme="majorBidi" w:hAnsiTheme="majorBidi" w:cstheme="majorBidi"/>
-          <w:sz w:val="28"/>
-          <w:szCs w:val="28"/>
+          <w:sz w:val="2"/>
+          <w:szCs w:val="2"/>
         </w:rPr>
       </w:pPr>
     </w:p>
@@ -28286,7 +29034,6 @@
           <w:sz w:val="36"/>
           <w:szCs w:val="36"/>
         </w:rPr>
-        <w:lastRenderedPageBreak/>
         <w:t>Network</w:t>
       </w:r>
       <w:r>
@@ -28918,7 +29665,7 @@
           </mc:Choice>
           <mc:Fallback>
             <w:pict>
-              <v:rect w14:anchorId="305192F6" id="Rectangle 13" o:spid="_x0000_s1038" style="position:absolute;left:0;text-align:left;margin-left:21.9pt;margin-top:-.05pt;width:243pt;height:137.4pt;z-index:251673600;visibility:visible;mso-wrap-style:square;mso-width-percent:0;mso-height-percent:0;mso-wrap-distance-left:9pt;mso-wrap-distance-top:0;mso-wrap-distance-right:9pt;mso-wrap-distance-bottom:0;mso-position-horizontal:absolute;mso-position-horizontal-relative:margin;mso-position-vertical:absolute;mso-position-vertical-relative:text;mso-width-percent:0;mso-height-percent:0;mso-width-relative:margin;mso-height-relative:margin;v-text-anchor:middle" o:gfxdata="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" fillcolor="black [3200]" strokecolor="black [480]" strokeweight="1pt">
+              <v:rect w14:anchorId="305192F6" id="Rectangle 13" o:spid="_x0000_s1040" style="position:absolute;left:0;text-align:left;margin-left:21.9pt;margin-top:-.05pt;width:243pt;height:137.4pt;z-index:251673600;visibility:visible;mso-wrap-style:square;mso-width-percent:0;mso-height-percent:0;mso-wrap-distance-left:9pt;mso-wrap-distance-top:0;mso-wrap-distance-right:9pt;mso-wrap-distance-bottom:0;mso-position-horizontal:absolute;mso-position-horizontal-relative:margin;mso-position-vertical:absolute;mso-position-vertical-relative:text;mso-width-percent:0;mso-height-percent:0;mso-width-relative:margin;mso-height-relative:margin;v-text-anchor:middle" o:gfxdata="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" fillcolor="black [3200]" strokecolor="black [480]" strokeweight="1pt">
                 <v:textbox>
                   <w:txbxContent>
                     <w:p>
@@ -29570,7 +30317,7 @@
           </mc:Choice>
           <mc:Fallback>
             <w:pict>
-              <v:rect w14:anchorId="45735527" id="Rectangle 14" o:spid="_x0000_s1039" style="position:absolute;left:0;text-align:left;margin-left:18pt;margin-top:57.1pt;width:496.2pt;height:61.8pt;z-index:251674624;visibility:visible;mso-wrap-style:square;mso-width-percent:0;mso-height-percent:0;mso-wrap-distance-left:9pt;mso-wrap-distance-top:0;mso-wrap-distance-right:9pt;mso-wrap-distance-bottom:0;mso-position-horizontal:absolute;mso-position-horizontal-relative:margin;mso-position-vertical:absolute;mso-position-vertical-relative:text;mso-width-percent:0;mso-height-percent:0;mso-width-relative:margin;mso-height-relative:margin;v-text-anchor:middle" o:gfxdata="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" fillcolor="black [3200]" strokecolor="black [480]" strokeweight="1pt">
+              <v:rect w14:anchorId="45735527" id="Rectangle 14" o:spid="_x0000_s1041" style="position:absolute;left:0;text-align:left;margin-left:18pt;margin-top:57.1pt;width:496.2pt;height:61.8pt;z-index:251674624;visibility:visible;mso-wrap-style:square;mso-width-percent:0;mso-height-percent:0;mso-wrap-distance-left:9pt;mso-wrap-distance-top:0;mso-wrap-distance-right:9pt;mso-wrap-distance-bottom:0;mso-position-horizontal:absolute;mso-position-horizontal-relative:margin;mso-position-vertical:absolute;mso-position-vertical-relative:text;mso-width-percent:0;mso-height-percent:0;mso-width-relative:margin;mso-height-relative:margin;v-text-anchor:middle" o:gfxdata="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" fillcolor="black [3200]" strokecolor="black [480]" strokeweight="1pt">
                 <v:textbox>
                   <w:txbxContent>
                     <w:p>
@@ -29799,6 +30546,7 @@
           <w:sz w:val="28"/>
           <w:szCs w:val="28"/>
         </w:rPr>
+        <w:lastRenderedPageBreak/>
         <w:t xml:space="preserve">If </w:t>
       </w:r>
       <w:r>
@@ -29945,175 +30693,23 @@
       <w:r>
         <w:rPr>
           <w:rFonts w:asciiTheme="majorBidi" w:hAnsiTheme="majorBidi" w:cstheme="majorBidi"/>
-          <w:sz w:val="28"/>
-          <w:szCs w:val="28"/>
-        </w:rPr>
-        <w:t xml:space="preserve">The legacy </w:t>
-      </w:r>
-      <w:r>
-        <w:rPr>
-          <w:rFonts w:asciiTheme="majorBidi" w:hAnsiTheme="majorBidi" w:cstheme="majorBidi"/>
-          <w:b/>
-          <w:bCs/>
-          <w:i/>
-          <w:iCs/>
-          <w:sz w:val="28"/>
-          <w:szCs w:val="28"/>
-        </w:rPr>
-        <w:t>links</w:t>
-      </w:r>
-      <w:r>
-        <w:rPr>
-          <w:rFonts w:asciiTheme="majorBidi" w:hAnsiTheme="majorBidi" w:cstheme="majorBidi"/>
-          <w:sz w:val="28"/>
-          <w:szCs w:val="28"/>
-        </w:rPr>
-        <w:t xml:space="preserve"> directive set up hostname resolution in the container’s </w:t>
-      </w:r>
-      <w:r>
-        <w:rPr>
-          <w:rFonts w:asciiTheme="majorBidi" w:hAnsiTheme="majorBidi" w:cstheme="majorBidi"/>
-          <w:b/>
-          <w:bCs/>
-          <w:i/>
-          <w:iCs/>
-          <w:sz w:val="28"/>
-          <w:szCs w:val="28"/>
-        </w:rPr>
-        <w:t>/</w:t>
-      </w:r>
-      <w:proofErr w:type="spellStart"/>
-      <w:r>
-        <w:rPr>
-          <w:rFonts w:asciiTheme="majorBidi" w:hAnsiTheme="majorBidi" w:cstheme="majorBidi"/>
-          <w:b/>
-          <w:bCs/>
-          <w:i/>
-          <w:iCs/>
-          <w:sz w:val="28"/>
-          <w:szCs w:val="28"/>
-        </w:rPr>
-        <w:t>etc</w:t>
-      </w:r>
-      <w:proofErr w:type="spellEnd"/>
-      <w:r>
-        <w:rPr>
-          <w:rFonts w:asciiTheme="majorBidi" w:hAnsiTheme="majorBidi" w:cstheme="majorBidi"/>
-          <w:b/>
-          <w:bCs/>
-          <w:i/>
-          <w:iCs/>
-          <w:sz w:val="28"/>
-          <w:szCs w:val="28"/>
-        </w:rPr>
-        <w:t>/hosts</w:t>
-      </w:r>
-      <w:r>
-        <w:rPr>
-          <w:rFonts w:asciiTheme="majorBidi" w:hAnsiTheme="majorBidi" w:cstheme="majorBidi"/>
-          <w:sz w:val="28"/>
-          <w:szCs w:val="28"/>
-        </w:rPr>
-        <w:t xml:space="preserve"> file. In modern, dedicated bridge or overlay networks, this is handled more cleanly via </w:t>
-      </w:r>
-      <w:r>
-        <w:rPr>
-          <w:rFonts w:asciiTheme="majorBidi" w:hAnsiTheme="majorBidi" w:cstheme="majorBidi"/>
-          <w:b/>
-          <w:bCs/>
-          <w:i/>
-          <w:iCs/>
-          <w:sz w:val="28"/>
-          <w:szCs w:val="28"/>
-        </w:rPr>
-        <w:t>aliases</w:t>
-      </w:r>
-      <w:r>
-        <w:rPr>
-          <w:rFonts w:asciiTheme="majorBidi" w:hAnsiTheme="majorBidi" w:cstheme="majorBidi"/>
-          <w:sz w:val="28"/>
-          <w:szCs w:val="28"/>
-        </w:rPr>
-        <w:t xml:space="preserve"> within the service’s network definition.</w:t>
-      </w:r>
-      <w:r>
-        <w:rPr>
-          <w:rFonts w:asciiTheme="majorBidi" w:hAnsiTheme="majorBidi" w:cstheme="majorBidi"/>
-          <w:sz w:val="28"/>
-          <w:szCs w:val="28"/>
-        </w:rPr>
-        <w:t xml:space="preserve"> </w:t>
-      </w:r>
-      <w:r>
-        <w:rPr>
-          <w:rFonts w:asciiTheme="majorBidi" w:hAnsiTheme="majorBidi" w:cstheme="majorBidi"/>
-          <w:sz w:val="28"/>
-          <w:szCs w:val="28"/>
-        </w:rPr>
-        <w:t xml:space="preserve">The </w:t>
-      </w:r>
-      <w:r>
-        <w:rPr>
-          <w:rFonts w:asciiTheme="majorBidi" w:hAnsiTheme="majorBidi" w:cstheme="majorBidi"/>
-          <w:b/>
-          <w:bCs/>
-          <w:i/>
-          <w:iCs/>
-          <w:sz w:val="28"/>
-          <w:szCs w:val="28"/>
-        </w:rPr>
-        <w:t>aliases</w:t>
-      </w:r>
-      <w:r>
-        <w:rPr>
-          <w:rFonts w:asciiTheme="majorBidi" w:hAnsiTheme="majorBidi" w:cstheme="majorBidi"/>
-          <w:sz w:val="28"/>
-          <w:szCs w:val="28"/>
-        </w:rPr>
-        <w:t xml:space="preserve"> directive allows you to specify alternate names a service should be resolvable by within its attached network(s).</w:t>
-      </w:r>
-    </w:p>
-    <w:p>
-      <w:pPr>
-        <w:ind w:left="360"/>
-        <w:jc w:val="both"/>
-        <w:rPr>
-          <w:rFonts w:asciiTheme="majorBidi" w:hAnsiTheme="majorBidi" w:cstheme="majorBidi"/>
-          <w:sz w:val="28"/>
-          <w:szCs w:val="28"/>
-        </w:rPr>
-      </w:pPr>
-    </w:p>
-    <w:p>
-      <w:pPr>
-        <w:jc w:val="both"/>
-        <w:rPr>
-          <w:rFonts w:asciiTheme="majorBidi" w:hAnsiTheme="majorBidi" w:cstheme="majorBidi"/>
-          <w:sz w:val="28"/>
-          <w:szCs w:val="28"/>
-        </w:rPr>
-      </w:pPr>
-      <w:r>
-        <w:rPr>
-          <w:rFonts w:asciiTheme="majorBidi" w:hAnsiTheme="majorBidi" w:cstheme="majorBidi"/>
           <w:noProof/>
           <w:sz w:val="28"/>
           <w:szCs w:val="28"/>
         </w:rPr>
-        <w:lastRenderedPageBreak/>
         <mc:AlternateContent>
           <mc:Choice Requires="wps">
             <w:drawing>
-              <wp:anchor distT="0" distB="0" distL="114300" distR="114300" simplePos="0" relativeHeight="251675648" behindDoc="0" locked="0" layoutInCell="1" allowOverlap="1" wp14:anchorId="2A770190" wp14:editId="3FBBEE15">
+              <wp:anchor distT="0" distB="0" distL="114300" distR="114300" simplePos="0" relativeHeight="251675648" behindDoc="0" locked="0" layoutInCell="1" allowOverlap="1" wp14:anchorId="2A770190" wp14:editId="762C3315">
                 <wp:simplePos x="0" y="0"/>
                 <wp:positionH relativeFrom="column">
-                  <wp:posOffset>219075</wp:posOffset>
+                  <wp:posOffset>242047</wp:posOffset>
                 </wp:positionH>
                 <wp:positionV relativeFrom="paragraph">
-                  <wp:posOffset>-9525</wp:posOffset>
+                  <wp:posOffset>1012307</wp:posOffset>
                 </wp:positionV>
-                <wp:extent cx="4943475" cy="2019300"/>
-                <wp:effectExtent l="0" t="0" r="28575" b="19050"/>
+                <wp:extent cx="4943475" cy="2043953"/>
+                <wp:effectExtent l="0" t="0" r="28575" b="13970"/>
                 <wp:wrapNone/>
                 <wp:docPr id="335306084" name="Rectangle 15"/>
                 <wp:cNvGraphicFramePr/>
@@ -30124,7 +30720,7 @@
                       <wps:spPr>
                         <a:xfrm>
                           <a:off x="0" y="0"/>
-                          <a:ext cx="4943475" cy="2019300"/>
+                          <a:ext cx="4943475" cy="2043953"/>
                         </a:xfrm>
                         <a:prstGeom prst="rect">
                           <a:avLst/>
@@ -30495,7 +31091,7 @@
           </mc:Choice>
           <mc:Fallback>
             <w:pict>
-              <v:rect w14:anchorId="2A770190" id="Rectangle 15" o:spid="_x0000_s1040" style="position:absolute;left:0;text-align:left;margin-left:17.25pt;margin-top:-.75pt;width:389.25pt;height:159pt;z-index:251675648;visibility:visible;mso-wrap-style:square;mso-width-percent:0;mso-height-percent:0;mso-wrap-distance-left:9pt;mso-wrap-distance-top:0;mso-wrap-distance-right:9pt;mso-wrap-distance-bottom:0;mso-position-horizontal:absolute;mso-position-horizontal-relative:text;mso-position-vertical:absolute;mso-position-vertical-relative:text;mso-width-percent:0;mso-height-percent:0;mso-width-relative:margin;mso-height-relative:margin;v-text-anchor:middle" o:gfxdata="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" fillcolor="black [3200]" strokecolor="black [480]" strokeweight="1pt">
+              <v:rect w14:anchorId="2A770190" id="Rectangle 15" o:spid="_x0000_s1042" style="position:absolute;left:0;text-align:left;margin-left:19.05pt;margin-top:79.7pt;width:389.25pt;height:160.95pt;z-index:251675648;visibility:visible;mso-wrap-style:square;mso-width-percent:0;mso-height-percent:0;mso-wrap-distance-left:9pt;mso-wrap-distance-top:0;mso-wrap-distance-right:9pt;mso-wrap-distance-bottom:0;mso-position-horizontal:absolute;mso-position-horizontal-relative:text;mso-position-vertical:absolute;mso-position-vertical-relative:text;mso-width-percent:0;mso-height-percent:0;mso-width-relative:margin;mso-height-relative:margin;v-text-anchor:middle" o:gfxdata="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" fillcolor="black [3200]" strokecolor="black [480]" strokeweight="1pt">
                 <v:textbox>
                   <w:txbxContent>
                     <w:p>
@@ -30830,9 +31426,140 @@
           </mc:Fallback>
         </mc:AlternateContent>
       </w:r>
+      <w:r>
+        <w:rPr>
+          <w:rFonts w:asciiTheme="majorBidi" w:hAnsiTheme="majorBidi" w:cstheme="majorBidi"/>
+          <w:sz w:val="28"/>
+          <w:szCs w:val="28"/>
+        </w:rPr>
+        <w:t xml:space="preserve">The legacy </w:t>
+      </w:r>
+      <w:r>
+        <w:rPr>
+          <w:rFonts w:asciiTheme="majorBidi" w:hAnsiTheme="majorBidi" w:cstheme="majorBidi"/>
+          <w:b/>
+          <w:bCs/>
+          <w:i/>
+          <w:iCs/>
+          <w:sz w:val="28"/>
+          <w:szCs w:val="28"/>
+        </w:rPr>
+        <w:t>links</w:t>
+      </w:r>
+      <w:r>
+        <w:rPr>
+          <w:rFonts w:asciiTheme="majorBidi" w:hAnsiTheme="majorBidi" w:cstheme="majorBidi"/>
+          <w:sz w:val="28"/>
+          <w:szCs w:val="28"/>
+        </w:rPr>
+        <w:t xml:space="preserve"> directive set up hostname resolution in the container’s </w:t>
+      </w:r>
+      <w:r>
+        <w:rPr>
+          <w:rFonts w:asciiTheme="majorBidi" w:hAnsiTheme="majorBidi" w:cstheme="majorBidi"/>
+          <w:b/>
+          <w:bCs/>
+          <w:i/>
+          <w:iCs/>
+          <w:sz w:val="28"/>
+          <w:szCs w:val="28"/>
+        </w:rPr>
+        <w:t>/</w:t>
+      </w:r>
+      <w:proofErr w:type="spellStart"/>
+      <w:r>
+        <w:rPr>
+          <w:rFonts w:asciiTheme="majorBidi" w:hAnsiTheme="majorBidi" w:cstheme="majorBidi"/>
+          <w:b/>
+          <w:bCs/>
+          <w:i/>
+          <w:iCs/>
+          <w:sz w:val="28"/>
+          <w:szCs w:val="28"/>
+        </w:rPr>
+        <w:t>etc</w:t>
+      </w:r>
+      <w:proofErr w:type="spellEnd"/>
+      <w:r>
+        <w:rPr>
+          <w:rFonts w:asciiTheme="majorBidi" w:hAnsiTheme="majorBidi" w:cstheme="majorBidi"/>
+          <w:b/>
+          <w:bCs/>
+          <w:i/>
+          <w:iCs/>
+          <w:sz w:val="28"/>
+          <w:szCs w:val="28"/>
+        </w:rPr>
+        <w:t>/hosts</w:t>
+      </w:r>
+      <w:r>
+        <w:rPr>
+          <w:rFonts w:asciiTheme="majorBidi" w:hAnsiTheme="majorBidi" w:cstheme="majorBidi"/>
+          <w:sz w:val="28"/>
+          <w:szCs w:val="28"/>
+        </w:rPr>
+        <w:t xml:space="preserve"> file. In modern, dedicated bridge or overlay networks, this is handled more cleanly via </w:t>
+      </w:r>
+      <w:r>
+        <w:rPr>
+          <w:rFonts w:asciiTheme="majorBidi" w:hAnsiTheme="majorBidi" w:cstheme="majorBidi"/>
+          <w:b/>
+          <w:bCs/>
+          <w:i/>
+          <w:iCs/>
+          <w:sz w:val="28"/>
+          <w:szCs w:val="28"/>
+        </w:rPr>
+        <w:t>aliases</w:t>
+      </w:r>
+      <w:r>
+        <w:rPr>
+          <w:rFonts w:asciiTheme="majorBidi" w:hAnsiTheme="majorBidi" w:cstheme="majorBidi"/>
+          <w:sz w:val="28"/>
+          <w:szCs w:val="28"/>
+        </w:rPr>
+        <w:t xml:space="preserve"> within the service’s network definition.</w:t>
+      </w:r>
+      <w:r>
+        <w:rPr>
+          <w:rFonts w:asciiTheme="majorBidi" w:hAnsiTheme="majorBidi" w:cstheme="majorBidi"/>
+          <w:sz w:val="28"/>
+          <w:szCs w:val="28"/>
+        </w:rPr>
+        <w:t xml:space="preserve"> </w:t>
+      </w:r>
+      <w:r>
+        <w:rPr>
+          <w:rFonts w:asciiTheme="majorBidi" w:hAnsiTheme="majorBidi" w:cstheme="majorBidi"/>
+          <w:sz w:val="28"/>
+          <w:szCs w:val="28"/>
+        </w:rPr>
+        <w:t xml:space="preserve">The </w:t>
+      </w:r>
+      <w:r>
+        <w:rPr>
+          <w:rFonts w:asciiTheme="majorBidi" w:hAnsiTheme="majorBidi" w:cstheme="majorBidi"/>
+          <w:b/>
+          <w:bCs/>
+          <w:i/>
+          <w:iCs/>
+          <w:sz w:val="28"/>
+          <w:szCs w:val="28"/>
+        </w:rPr>
+        <w:t>aliases</w:t>
+      </w:r>
+      <w:r>
+        <w:rPr>
+          <w:rFonts w:asciiTheme="majorBidi" w:hAnsiTheme="majorBidi" w:cstheme="majorBidi"/>
+          <w:sz w:val="28"/>
+          <w:szCs w:val="28"/>
+        </w:rPr>
+        <w:t xml:space="preserve"> directive allows you to specify alternate names a service should be resolvable by within its attached network(s).</w:t>
+      </w:r>
     </w:p>
     <w:p>
       <w:pPr>
+        <w:ind w:left="360"/>
         <w:jc w:val="both"/>
         <w:rPr>
           <w:rFonts w:asciiTheme="majorBidi" w:hAnsiTheme="majorBidi" w:cstheme="majorBidi"/>
@@ -30866,20 +31593,30 @@
         <w:jc w:val="both"/>
         <w:rPr>
           <w:rFonts w:asciiTheme="majorBidi" w:hAnsiTheme="majorBidi" w:cstheme="majorBidi"/>
+          <w:sz w:val="28"/>
+          <w:szCs w:val="28"/>
+        </w:rPr>
+      </w:pPr>
+    </w:p>
+    <w:p>
+      <w:pPr>
+        <w:jc w:val="both"/>
+        <w:rPr>
+          <w:rFonts w:asciiTheme="majorBidi" w:hAnsiTheme="majorBidi" w:cstheme="majorBidi"/>
+          <w:sz w:val="28"/>
+          <w:szCs w:val="28"/>
+        </w:rPr>
+      </w:pPr>
+    </w:p>
+    <w:p>
+      <w:pPr>
+        <w:jc w:val="both"/>
+        <w:rPr>
+          <w:rFonts w:asciiTheme="majorBidi" w:hAnsiTheme="majorBidi" w:cstheme="majorBidi"/>
           <w:b/>
           <w:bCs/>
-          <w:sz w:val="36"/>
-          <w:szCs w:val="36"/>
-        </w:rPr>
-      </w:pPr>
-    </w:p>
-    <w:p>
-      <w:pPr>
-        <w:jc w:val="both"/>
-        <w:rPr>
-          <w:rFonts w:asciiTheme="majorBidi" w:hAnsiTheme="majorBidi" w:cstheme="majorBidi"/>
-          <w:b/>
-          <w:bCs/>
+          <w:sz w:val="32"/>
+          <w:szCs w:val="32"/>
         </w:rPr>
       </w:pPr>
     </w:p>
@@ -31490,6 +32227,7 @@
           <w:sz w:val="32"/>
           <w:szCs w:val="32"/>
         </w:rPr>
+        <w:lastRenderedPageBreak/>
         <w:t>docker compose stop</w:t>
       </w:r>
       <w:r>
@@ -31736,7 +32474,6 @@
           <w:sz w:val="28"/>
           <w:szCs w:val="28"/>
         </w:rPr>
-        <w:lastRenderedPageBreak/>
         <w:t>Stops and removes containers, networks, and volumes created by up.</w:t>
       </w:r>
       <w:r>
@@ -32744,6 +33481,7 @@
           <w:sz w:val="28"/>
           <w:szCs w:val="28"/>
         </w:rPr>
+        <w:lastRenderedPageBreak/>
         <w:t>View aggregated logs from the running containers.</w:t>
       </w:r>
       <w:r>
@@ -33118,7 +33856,6 @@
           <w:sz w:val="28"/>
           <w:szCs w:val="28"/>
         </w:rPr>
-        <w:lastRenderedPageBreak/>
         <w:t>Execute a command in a running container.</w:t>
       </w:r>
     </w:p>
@@ -34038,6 +34775,7 @@
           <w:sz w:val="28"/>
           <w:szCs w:val="28"/>
         </w:rPr>
+        <w:lastRenderedPageBreak/>
         <w:t xml:space="preserve">docker compose inspect </w:t>
       </w:r>
       <w:proofErr w:type="spellStart"/>
@@ -34425,7 +35163,6 @@
           <w:sz w:val="28"/>
           <w:szCs w:val="28"/>
         </w:rPr>
-        <w:lastRenderedPageBreak/>
         <w:t xml:space="preserve">docker compose cp </w:t>
       </w:r>
       <w:proofErr w:type="spellStart"/>
@@ -35452,6 +36189,7 @@
           <w:sz w:val="32"/>
           <w:szCs w:val="32"/>
         </w:rPr>
+        <w:lastRenderedPageBreak/>
         <w:t>Key Usage Patterns</w:t>
       </w:r>
       <w:r>
@@ -35637,7 +36375,7 @@
 </file>
 
 <file path=word/numbering.xml><?xml version="1.0" encoding="utf-8"?>
-<w:numbering xmlns:wpc="http://schemas.microsoft.com/office/word/2010/wordprocessingCanvas" xmlns:cx="http://schemas.microsoft.com/office/drawing/2014/chartex" xmlns:cx1="http://schemas.microsoft.com/office/drawing/2015/9/8/chartex" xmlns:cx2="http://schemas.microsoft.com/office/drawing/2015/10/21/chartex" xmlns:cx3="http://schemas.microsoft.com/office/drawing/2016/5/9/chartex" xmlns:cx4="http://schemas.microsoft.com/office/drawing/2016/5/10/chartex" xmlns:cx5="http://schemas.microsoft.com/office/drawing/2016/5/11/chartex" xmlns:cx6="http://schemas.microsoft.com/office/drawing/2016/5/12/chartex" xmlns:cx7="http://schemas.microsoft.com/office/drawing/2016/5/13/chartex" xmlns:cx8="http://schemas.microsoft.com/office/drawing/2016/5/14/chartex" xmlns:mc="http://schemas.openxmlformats.org/markup-compatibility/2006" xmlns:aink="http://schemas.microsoft.com/office/drawing/2016/ink" xmlns:am3d="http://schemas.microsoft.com/office/drawing/2017/model3d" xmlns:o="urn:schemas-microsoft-com:office:office" xmlns:oel="http://schemas.microsoft.com/office/2019/extlst" xmlns:r="http://schemas.openxmlformats.org/officeDocument/2006/relationships" xmlns:m="http://schemas.openxmlformats.org/officeDocument/2006/math" xmlns:v="urn:schemas-microsoft-com:vml" xmlns:wp14="http://schemas.microsoft.com/office/word/2010/wordprocessingDrawing" xmlns:wp="http://schemas.openxmlformats.org/drawingml/2006/wordprocessingDrawing" xmlns:w10="urn:schemas-microsoft-com:office:word" xmlns:w="http://schemas.openxmlformats.org/wordprocessingml/2006/main" xmlns:w14="http://schemas.microsoft.com/office/word/2010/wordml" xmlns:w15="http://schemas.microsoft.com/office/word/2012/wordml" xmlns:w16cex="http://schemas.microsoft.com/office/word/2018/wordml/cex" xmlns:w16cid="http://schemas.microsoft.com/office/word/2016/wordml/cid" xmlns:w16="http://schemas.microsoft.com/office/word/2018/wordml" xmlns:w16sdtdh="http://schemas.microsoft.com/office/word/2020/wordml/sdtdatahash" xmlns:w16se="http://schemas.microsoft.com/office/word/2015/wordml/symex" xmlns:wpg="http://schemas.microsoft.com/office/word/2010/wordprocessingGroup" xmlns:wpi="http://schemas.microsoft.com/office/word/2010/wordprocessingInk" xmlns:wne="http://schemas.microsoft.com/office/word/2006/wordml" xmlns:wps="http://schemas.microsoft.com/office/word/2010/wordprocessingShape" mc:Ignorable="w14 w15 w16se w16cid w16 w16cex w16sdtdh wp14">
+<w:numbering xmlns:wpc="http://schemas.microsoft.com/office/word/2010/wordprocessingCanvas" xmlns:cx="http://schemas.microsoft.com/office/drawing/2014/chartex" xmlns:cx1="http://schemas.microsoft.com/office/drawing/2015/9/8/chartex" xmlns:cx2="http://schemas.microsoft.com/office/drawing/2015/10/21/chartex" xmlns:cx3="http://schemas.microsoft.com/office/drawing/2016/5/9/chartex" xmlns:cx4="http://schemas.microsoft.com/office/drawing/2016/5/10/chartex" xmlns:cx5="http://schemas.microsoft.com/office/drawing/2016/5/11/chartex" xmlns:cx6="http://schemas.microsoft.com/office/drawing/2016/5/12/chartex" xmlns:cx7="http://schemas.microsoft.com/office/drawing/2016/5/13/chartex" xmlns:cx8="http://schemas.microsoft.com/office/drawing/2016/5/14/chartex" xmlns:mc="http://schemas.openxmlformats.org/markup-compatibility/2006" xmlns:aink="http://schemas.microsoft.com/office/drawing/2016/ink" xmlns:am3d="http://schemas.microsoft.com/office/drawing/2017/model3d" xmlns:o="urn:schemas-microsoft-com:office:office" xmlns:oel="http://schemas.microsoft.com/office/2019/extlst" xmlns:r="http://schemas.openxmlformats.org/officeDocument/2006/relationships" xmlns:m="http://schemas.openxmlformats.org/officeDocument/2006/math" xmlns:v="urn:schemas-microsoft-com:vml" xmlns:wp14="http://schemas.microsoft.com/office/word/2010/wordprocessingDrawing" xmlns:wp="http://schemas.openxmlformats.org/drawingml/2006/wordprocessingDrawing" xmlns:w10="urn:schemas-microsoft-com:office:word" xmlns:w="http://schemas.openxmlformats.org/wordprocessingml/2006/main" xmlns:w14="http://schemas.microsoft.com/office/word/2010/wordml" xmlns:w15="http://schemas.microsoft.com/office/word/2012/wordml" xmlns:w16cex="http://schemas.microsoft.com/office/word/2018/wordml/cex" xmlns:w16cid="http://schemas.microsoft.com/office/word/2016/wordml/cid" xmlns:w16="http://schemas.microsoft.com/office/word/2018/wordml" xmlns:w16du="http://schemas.microsoft.com/office/word/2023/wordml/word16du" xmlns:w16sdtdh="http://schemas.microsoft.com/office/word/2020/wordml/sdtdatahash" xmlns:w16sdtfl="http://schemas.microsoft.com/office/word/2024/wordml/sdtformatlock" xmlns:w16se="http://schemas.microsoft.com/office/word/2015/wordml/symex" xmlns:wpg="http://schemas.microsoft.com/office/word/2010/wordprocessingGroup" xmlns:wpi="http://schemas.microsoft.com/office/word/2010/wordprocessingInk" xmlns:wne="http://schemas.microsoft.com/office/word/2006/wordml" xmlns:wps="http://schemas.microsoft.com/office/word/2010/wordprocessingShape" mc:Ignorable="w14 w15 w16se w16cid w16 w16cex w16sdtdh w16sdtfl w16du wp14">
   <w:abstractNum w:abstractNumId="0" w15:restartNumberingAfterBreak="0">
     <w:nsid w:val="05CF0BF4"/>
     <w:multiLevelType w:val="hybridMultilevel"/>
@@ -36882,6 +37620,119 @@
     </w:lvl>
   </w:abstractNum>
   <w:abstractNum w:abstractNumId="11" w15:restartNumberingAfterBreak="0">
+    <w:nsid w:val="44A94C1D"/>
+    <w:multiLevelType w:val="hybridMultilevel"/>
+    <w:tmpl w:val="5980183E"/>
+    <w:lvl w:ilvl="0" w:tplc="0409000D">
+      <w:start w:val="1"/>
+      <w:numFmt w:val="bullet"/>
+      <w:lvlText w:val=""/>
+      <w:lvlJc w:val="left"/>
+      <w:pPr>
+        <w:ind w:left="720" w:hanging="360"/>
+      </w:pPr>
+      <w:rPr>
+        <w:rFonts w:ascii="Wingdings" w:hAnsi="Wingdings" w:hint="default"/>
+      </w:rPr>
+    </w:lvl>
+    <w:lvl w:ilvl="1" w:tplc="04090003" w:tentative="1">
+      <w:start w:val="1"/>
+      <w:numFmt w:val="bullet"/>
+      <w:lvlText w:val="o"/>
+      <w:lvlJc w:val="left"/>
+      <w:pPr>
+        <w:ind w:left="1440" w:hanging="360"/>
+      </w:pPr>
+      <w:rPr>
+        <w:rFonts w:ascii="Courier New" w:hAnsi="Courier New" w:cs="Courier New" w:hint="default"/>
+      </w:rPr>
+    </w:lvl>
+    <w:lvl w:ilvl="2" w:tplc="04090005" w:tentative="1">
+      <w:start w:val="1"/>
+      <w:numFmt w:val="bullet"/>
+      <w:lvlText w:val=""/>
+      <w:lvlJc w:val="left"/>
+      <w:pPr>
+        <w:ind w:left="2160" w:hanging="360"/>
+      </w:pPr>
+      <w:rPr>
+        <w:rFonts w:ascii="Wingdings" w:hAnsi="Wingdings" w:hint="default"/>
+      </w:rPr>
+    </w:lvl>
+    <w:lvl w:ilvl="3" w:tplc="04090001" w:tentative="1">
+      <w:start w:val="1"/>
+      <w:numFmt w:val="bullet"/>
+      <w:lvlText w:val=""/>
+      <w:lvlJc w:val="left"/>
+      <w:pPr>
+        <w:ind w:left="2880" w:hanging="360"/>
+      </w:pPr>
+      <w:rPr>
+        <w:rFonts w:ascii="Symbol" w:hAnsi="Symbol" w:hint="default"/>
+      </w:rPr>
+    </w:lvl>
+    <w:lvl w:ilvl="4" w:tplc="04090003" w:tentative="1">
+      <w:start w:val="1"/>
+      <w:numFmt w:val="bullet"/>
+      <w:lvlText w:val="o"/>
+      <w:lvlJc w:val="left"/>
+      <w:pPr>
+        <w:ind w:left="3600" w:hanging="360"/>
+      </w:pPr>
+      <w:rPr>
+        <w:rFonts w:ascii="Courier New" w:hAnsi="Courier New" w:cs="Courier New" w:hint="default"/>
+      </w:rPr>
+    </w:lvl>
+    <w:lvl w:ilvl="5" w:tplc="04090005" w:tentative="1">
+      <w:start w:val="1"/>
+      <w:numFmt w:val="bullet"/>
+      <w:lvlText w:val=""/>
+      <w:lvlJc w:val="left"/>
+      <w:pPr>
+        <w:ind w:left="4320" w:hanging="360"/>
+      </w:pPr>
+      <w:rPr>
+        <w:rFonts w:ascii="Wingdings" w:hAnsi="Wingdings" w:hint="default"/>
+      </w:rPr>
+    </w:lvl>
+    <w:lvl w:ilvl="6" w:tplc="04090001" w:tentative="1">
+      <w:start w:val="1"/>
+      <w:numFmt w:val="bullet"/>
+      <w:lvlText w:val=""/>
+      <w:lvlJc w:val="left"/>
+      <w:pPr>
+        <w:ind w:left="5040" w:hanging="360"/>
+      </w:pPr>
+      <w:rPr>
+        <w:rFonts w:ascii="Symbol" w:hAnsi="Symbol" w:hint="default"/>
+      </w:rPr>
+    </w:lvl>
+    <w:lvl w:ilvl="7" w:tplc="04090003" w:tentative="1">
+      <w:start w:val="1"/>
+      <w:numFmt w:val="bullet"/>
+      <w:lvlText w:val="o"/>
+      <w:lvlJc w:val="left"/>
+      <w:pPr>
+        <w:ind w:left="5760" w:hanging="360"/>
+      </w:pPr>
+      <w:rPr>
+        <w:rFonts w:ascii="Courier New" w:hAnsi="Courier New" w:cs="Courier New" w:hint="default"/>
+      </w:rPr>
+    </w:lvl>
+    <w:lvl w:ilvl="8" w:tplc="04090005" w:tentative="1">
+      <w:start w:val="1"/>
+      <w:numFmt w:val="bullet"/>
+      <w:lvlText w:val=""/>
+      <w:lvlJc w:val="left"/>
+      <w:pPr>
+        <w:ind w:left="6480" w:hanging="360"/>
+      </w:pPr>
+      <w:rPr>
+        <w:rFonts w:ascii="Wingdings" w:hAnsi="Wingdings" w:hint="default"/>
+      </w:rPr>
+    </w:lvl>
+  </w:abstractNum>
+  <w:abstractNum w:abstractNumId="12" w15:restartNumberingAfterBreak="0">
     <w:nsid w:val="4DFB4C02"/>
     <w:multiLevelType w:val="hybridMultilevel"/>
     <w:tmpl w:val="41F0E36A"/>
@@ -36994,7 +37845,7 @@
       </w:rPr>
     </w:lvl>
   </w:abstractNum>
-  <w:abstractNum w:abstractNumId="12" w15:restartNumberingAfterBreak="0">
+  <w:abstractNum w:abstractNumId="13" w15:restartNumberingAfterBreak="0">
     <w:nsid w:val="4F8E4DFE"/>
     <w:multiLevelType w:val="hybridMultilevel"/>
     <w:tmpl w:val="AD3C6652"/>
@@ -37107,7 +37958,7 @@
       </w:rPr>
     </w:lvl>
   </w:abstractNum>
-  <w:abstractNum w:abstractNumId="13" w15:restartNumberingAfterBreak="0">
+  <w:abstractNum w:abstractNumId="14" w15:restartNumberingAfterBreak="0">
     <w:nsid w:val="569C79CE"/>
     <w:multiLevelType w:val="hybridMultilevel"/>
     <w:tmpl w:val="4E744488"/>
@@ -37220,7 +38071,7 @@
       </w:rPr>
     </w:lvl>
   </w:abstractNum>
-  <w:abstractNum w:abstractNumId="14" w15:restartNumberingAfterBreak="0">
+  <w:abstractNum w:abstractNumId="15" w15:restartNumberingAfterBreak="0">
     <w:nsid w:val="57366A05"/>
     <w:multiLevelType w:val="hybridMultilevel"/>
     <w:tmpl w:val="FFB086EA"/>
@@ -37333,7 +38184,7 @@
       </w:rPr>
     </w:lvl>
   </w:abstractNum>
-  <w:abstractNum w:abstractNumId="15" w15:restartNumberingAfterBreak="0">
+  <w:abstractNum w:abstractNumId="16" w15:restartNumberingAfterBreak="0">
     <w:nsid w:val="57481C94"/>
     <w:multiLevelType w:val="hybridMultilevel"/>
     <w:tmpl w:val="0A1075DC"/>
@@ -37419,7 +38270,7 @@
       </w:pPr>
     </w:lvl>
   </w:abstractNum>
-  <w:abstractNum w:abstractNumId="16" w15:restartNumberingAfterBreak="0">
+  <w:abstractNum w:abstractNumId="17" w15:restartNumberingAfterBreak="0">
     <w:nsid w:val="5F436482"/>
     <w:multiLevelType w:val="hybridMultilevel"/>
     <w:tmpl w:val="11E49A98"/>
@@ -37532,7 +38383,7 @@
       </w:rPr>
     </w:lvl>
   </w:abstractNum>
-  <w:abstractNum w:abstractNumId="17" w15:restartNumberingAfterBreak="0">
+  <w:abstractNum w:abstractNumId="18" w15:restartNumberingAfterBreak="0">
     <w:nsid w:val="61430215"/>
     <w:multiLevelType w:val="hybridMultilevel"/>
     <w:tmpl w:val="F76A4BCA"/>
@@ -37645,7 +38496,7 @@
       </w:rPr>
     </w:lvl>
   </w:abstractNum>
-  <w:abstractNum w:abstractNumId="18" w15:restartNumberingAfterBreak="0">
+  <w:abstractNum w:abstractNumId="19" w15:restartNumberingAfterBreak="0">
     <w:nsid w:val="6A0D4B87"/>
     <w:multiLevelType w:val="hybridMultilevel"/>
     <w:tmpl w:val="7B24963A"/>
@@ -37758,7 +38609,7 @@
       </w:rPr>
     </w:lvl>
   </w:abstractNum>
-  <w:abstractNum w:abstractNumId="19" w15:restartNumberingAfterBreak="0">
+  <w:abstractNum w:abstractNumId="20" w15:restartNumberingAfterBreak="0">
     <w:nsid w:val="74CF70CE"/>
     <w:multiLevelType w:val="hybridMultilevel"/>
     <w:tmpl w:val="98C2F500"/>
@@ -37871,7 +38722,7 @@
       </w:rPr>
     </w:lvl>
   </w:abstractNum>
-  <w:abstractNum w:abstractNumId="20" w15:restartNumberingAfterBreak="0">
+  <w:abstractNum w:abstractNumId="21" w15:restartNumberingAfterBreak="0">
     <w:nsid w:val="782C7EDE"/>
     <w:multiLevelType w:val="hybridMultilevel"/>
     <w:tmpl w:val="B230804A"/>
@@ -37984,7 +38835,7 @@
       </w:rPr>
     </w:lvl>
   </w:abstractNum>
-  <w:abstractNum w:abstractNumId="21" w15:restartNumberingAfterBreak="0">
+  <w:abstractNum w:abstractNumId="22" w15:restartNumberingAfterBreak="0">
     <w:nsid w:val="7ADD40EB"/>
     <w:multiLevelType w:val="hybridMultilevel"/>
     <w:tmpl w:val="6D40D04E"/>
@@ -38097,7 +38948,7 @@
       </w:rPr>
     </w:lvl>
   </w:abstractNum>
-  <w:abstractNum w:abstractNumId="22" w15:restartNumberingAfterBreak="0">
+  <w:abstractNum w:abstractNumId="23" w15:restartNumberingAfterBreak="0">
     <w:nsid w:val="7CCA17AF"/>
     <w:multiLevelType w:val="hybridMultilevel"/>
     <w:tmpl w:val="A44A2B08"/>
@@ -38210,7 +39061,7 @@
       </w:rPr>
     </w:lvl>
   </w:abstractNum>
-  <w:abstractNum w:abstractNumId="23" w15:restartNumberingAfterBreak="0">
+  <w:abstractNum w:abstractNumId="24" w15:restartNumberingAfterBreak="0">
     <w:nsid w:val="7EBD656A"/>
     <w:multiLevelType w:val="hybridMultilevel"/>
     <w:tmpl w:val="B706E600"/>
@@ -38327,10 +39178,10 @@
     <w:abstractNumId w:val="5"/>
   </w:num>
   <w:num w:numId="2" w16cid:durableId="1503817410">
-    <w:abstractNumId w:val="18"/>
+    <w:abstractNumId w:val="19"/>
   </w:num>
   <w:num w:numId="3" w16cid:durableId="167447442">
-    <w:abstractNumId w:val="23"/>
+    <w:abstractNumId w:val="24"/>
   </w:num>
   <w:num w:numId="4" w16cid:durableId="1376346673">
     <w:abstractNumId w:val="7"/>
@@ -38339,49 +39190,49 @@
     <w:abstractNumId w:val="6"/>
   </w:num>
   <w:num w:numId="6" w16cid:durableId="113063070">
-    <w:abstractNumId w:val="15"/>
+    <w:abstractNumId w:val="16"/>
   </w:num>
   <w:num w:numId="7" w16cid:durableId="1731805272">
     <w:abstractNumId w:val="10"/>
   </w:num>
   <w:num w:numId="8" w16cid:durableId="1464889834">
-    <w:abstractNumId w:val="16"/>
+    <w:abstractNumId w:val="17"/>
   </w:num>
   <w:num w:numId="9" w16cid:durableId="1796754864">
     <w:abstractNumId w:val="3"/>
   </w:num>
   <w:num w:numId="10" w16cid:durableId="484057191">
-    <w:abstractNumId w:val="14"/>
+    <w:abstractNumId w:val="15"/>
   </w:num>
   <w:num w:numId="11" w16cid:durableId="1636906357">
-    <w:abstractNumId w:val="19"/>
+    <w:abstractNumId w:val="20"/>
   </w:num>
   <w:num w:numId="12" w16cid:durableId="466703823">
     <w:abstractNumId w:val="4"/>
   </w:num>
   <w:num w:numId="13" w16cid:durableId="978806757">
-    <w:abstractNumId w:val="22"/>
+    <w:abstractNumId w:val="23"/>
   </w:num>
   <w:num w:numId="14" w16cid:durableId="1101490758">
-    <w:abstractNumId w:val="11"/>
+    <w:abstractNumId w:val="12"/>
   </w:num>
   <w:num w:numId="15" w16cid:durableId="238827221">
-    <w:abstractNumId w:val="13"/>
+    <w:abstractNumId w:val="14"/>
   </w:num>
   <w:num w:numId="16" w16cid:durableId="894509451">
     <w:abstractNumId w:val="0"/>
   </w:num>
   <w:num w:numId="17" w16cid:durableId="587731260">
-    <w:abstractNumId w:val="17"/>
+    <w:abstractNumId w:val="18"/>
   </w:num>
   <w:num w:numId="18" w16cid:durableId="1468086315">
     <w:abstractNumId w:val="1"/>
   </w:num>
   <w:num w:numId="19" w16cid:durableId="1718702808">
-    <w:abstractNumId w:val="20"/>
+    <w:abstractNumId w:val="21"/>
   </w:num>
   <w:num w:numId="20" w16cid:durableId="2037658066">
-    <w:abstractNumId w:val="21"/>
+    <w:abstractNumId w:val="22"/>
   </w:num>
   <w:num w:numId="21" w16cid:durableId="710956789">
     <w:abstractNumId w:val="8"/>
@@ -38390,16 +39241,19 @@
     <w:abstractNumId w:val="9"/>
   </w:num>
   <w:num w:numId="23" w16cid:durableId="1622297513">
-    <w:abstractNumId w:val="12"/>
+    <w:abstractNumId w:val="13"/>
   </w:num>
   <w:num w:numId="24" w16cid:durableId="454325179">
     <w:abstractNumId w:val="2"/>
+  </w:num>
+  <w:num w:numId="25" w16cid:durableId="1523401273">
+    <w:abstractNumId w:val="11"/>
   </w:num>
 </w:numbering>
 </file>
 
 <file path=word/styles.xml><?xml version="1.0" encoding="utf-8"?>
-<w:styles xmlns:mc="http://schemas.openxmlformats.org/markup-compatibility/2006" xmlns:r="http://schemas.openxmlformats.org/officeDocument/2006/relationships" xmlns:w="http://schemas.openxmlformats.org/wordprocessingml/2006/main" xmlns:w14="http://schemas.microsoft.com/office/word/2010/wordml" xmlns:w15="http://schemas.microsoft.com/office/word/2012/wordml" xmlns:w16cex="http://schemas.microsoft.com/office/word/2018/wordml/cex" xmlns:w16cid="http://schemas.microsoft.com/office/word/2016/wordml/cid" xmlns:w16="http://schemas.microsoft.com/office/word/2018/wordml" xmlns:w16sdtdh="http://schemas.microsoft.com/office/word/2020/wordml/sdtdatahash" xmlns:w16se="http://schemas.microsoft.com/office/word/2015/wordml/symex" mc:Ignorable="w14 w15 w16se w16cid w16 w16cex w16sdtdh">
+<w:styles xmlns:mc="http://schemas.openxmlformats.org/markup-compatibility/2006" xmlns:r="http://schemas.openxmlformats.org/officeDocument/2006/relationships" xmlns:w="http://schemas.openxmlformats.org/wordprocessingml/2006/main" xmlns:w14="http://schemas.microsoft.com/office/word/2010/wordml" xmlns:w15="http://schemas.microsoft.com/office/word/2012/wordml" xmlns:w16cex="http://schemas.microsoft.com/office/word/2018/wordml/cex" xmlns:w16cid="http://schemas.microsoft.com/office/word/2016/wordml/cid" xmlns:w16="http://schemas.microsoft.com/office/word/2018/wordml" xmlns:w16du="http://schemas.microsoft.com/office/word/2023/wordml/word16du" xmlns:w16sdtdh="http://schemas.microsoft.com/office/word/2020/wordml/sdtdatahash" xmlns:w16sdtfl="http://schemas.microsoft.com/office/word/2024/wordml/sdtformatlock" xmlns:w16se="http://schemas.microsoft.com/office/word/2015/wordml/symex" mc:Ignorable="w14 w15 w16se w16cid w16 w16cex w16sdtdh w16sdtfl w16du">
   <w:docDefaults>
     <w:rPrDefault>
       <w:rPr>

</xml_diff>